<commit_message>
dhcp, mail, ftp, web, dns lima configurado
</commit_message>
<xml_diff>
--- a/CASO_ESTUDIO_GRUPO2.docx
+++ b/CASO_ESTUDIO_GRUPO2.docx
@@ -18,7 +18,7 @@
           <w:noProof/>
         </w:rPr>
         <w:drawing>
-          <wp:inline distT="0" distB="0" distL="0" distR="0" wp14:anchorId="74D9AF2F" wp14:editId="5E2282C7">
+          <wp:inline distT="0" distB="0" distL="0" distR="0" wp14:anchorId="74D9AF2F" wp14:editId="55490C91">
             <wp:extent cx="933450" cy="838200"/>
             <wp:effectExtent l="0" t="0" r="0" b="0"/>
             <wp:docPr id="358912511" name="Imagen 358912511" descr="Resultado de imagen para upc logo"/>
@@ -35,7 +35,7 @@
                     </pic:cNvPicPr>
                   </pic:nvPicPr>
                   <pic:blipFill>
-                    <a:blip r:embed="rId5" cstate="print">
+                    <a:blip r:embed="rId7" cstate="print">
                       <a:extLst>
                         <a:ext uri="{28A0092B-C50C-407E-A947-70E740481C1C}">
                           <a14:useLocalDpi xmlns:a14="http://schemas.microsoft.com/office/drawing/2010/main" val="0"/>
@@ -372,25 +372,7 @@
                 <w:color w:val="0000FF"/>
                 <w:szCs w:val="22"/>
               </w:rPr>
-              <w:t xml:space="preserve">Salcedo </w:t>
-            </w:r>
-            <w:proofErr w:type="spellStart"/>
-            <w:r>
-              <w:rPr>
-                <w:rFonts w:cs="Arial"/>
-                <w:color w:val="0000FF"/>
-                <w:szCs w:val="22"/>
-              </w:rPr>
-              <w:t>Polo,</w:t>
-            </w:r>
-            <w:proofErr w:type="spellEnd"/>
-            <w:r>
-              <w:rPr>
-                <w:rFonts w:cs="Arial"/>
-                <w:color w:val="0000FF"/>
-                <w:szCs w:val="22"/>
-              </w:rPr>
-              <w:t xml:space="preserve"> Jorge Luis</w:t>
+              <w:t>Salcedo Polo, Jorge Luis</w:t>
             </w:r>
           </w:p>
           <w:p>
@@ -765,7 +747,7 @@
     </w:p>
     <w:p>
       <w:pPr>
-        <w:pStyle w:val="Ttulo8"/>
+        <w:pStyle w:val="Heading8"/>
         <w:keepNext w:val="0"/>
         <w:tabs>
           <w:tab w:val="left" w:pos="426"/>
@@ -1259,8 +1241,8 @@
           <w:u w:val="single"/>
         </w:rPr>
         <w:sectPr>
-          <w:footerReference w:type="even" r:id="rId6"/>
-          <w:footerReference w:type="default" r:id="rId7"/>
+          <w:footerReference w:type="even" r:id="rId8"/>
+          <w:footerReference w:type="default" r:id="rId9"/>
           <w:pgSz w:w="11907" w:h="16840" w:code="9"/>
           <w:pgMar w:top="1418" w:right="1418" w:bottom="1418" w:left="1418" w:header="709" w:footer="709" w:gutter="0"/>
           <w:pgNumType w:start="1"/>
@@ -2274,7 +2256,7 @@
     </w:p>
     <w:p>
       <w:pPr>
-        <w:pStyle w:val="Prrafodelista"/>
+        <w:pStyle w:val="ListParagraph"/>
         <w:numPr>
           <w:ilvl w:val="0"/>
           <w:numId w:val="37"/>
@@ -2503,7 +2485,7 @@
     </w:p>
     <w:tbl>
       <w:tblPr>
-        <w:tblStyle w:val="Tablaconcuadrcula"/>
+        <w:tblStyle w:val="TableGrid"/>
         <w:tblW w:w="5000" w:type="pct"/>
         <w:tblLook w:val="04A0" w:firstRow="1" w:lastRow="0" w:firstColumn="1" w:lastColumn="0" w:noHBand="0" w:noVBand="1"/>
       </w:tblPr>
@@ -2825,6 +2807,7 @@
                                     <w:rPr>
                                       <w:sz w:val="16"/>
                                       <w:szCs w:val="14"/>
+                                      <w:highlight w:val="yellow"/>
                                     </w:rPr>
                                     <w:t>WAN</w:t>
                                   </w:r>
@@ -2833,6 +2816,7 @@
                                     <w:rPr>
                                       <w:sz w:val="16"/>
                                       <w:szCs w:val="14"/>
+                                      <w:highlight w:val="yellow"/>
                                     </w:rPr>
                                     <w:t>5 :</w:t>
                                   </w:r>
@@ -2841,15 +2825,9 @@
                                     <w:rPr>
                                       <w:sz w:val="16"/>
                                       <w:szCs w:val="14"/>
+                                      <w:highlight w:val="yellow"/>
                                     </w:rPr>
-                                    <w:t xml:space="preserve"> dos hosts</w:t>
-                                  </w:r>
-                                  <w:r>
-                                    <w:rPr>
-                                      <w:sz w:val="16"/>
-                                      <w:szCs w:val="14"/>
-                                    </w:rPr>
-                                    <w:t xml:space="preserve"> PPP-CHAP</w:t>
+                                    <w:t xml:space="preserve"> dos hosts PPP-CHAP</w:t>
                                   </w:r>
                                 </w:p>
                               </w:txbxContent>
@@ -2889,6 +2867,7 @@
                               <w:rPr>
                                 <w:sz w:val="16"/>
                                 <w:szCs w:val="14"/>
+                                <w:highlight w:val="yellow"/>
                               </w:rPr>
                               <w:t>WAN</w:t>
                             </w:r>
@@ -2897,6 +2876,7 @@
                               <w:rPr>
                                 <w:sz w:val="16"/>
                                 <w:szCs w:val="14"/>
+                                <w:highlight w:val="yellow"/>
                               </w:rPr>
                               <w:t>5 :</w:t>
                             </w:r>
@@ -2905,15 +2885,9 @@
                               <w:rPr>
                                 <w:sz w:val="16"/>
                                 <w:szCs w:val="14"/>
+                                <w:highlight w:val="yellow"/>
                               </w:rPr>
-                              <w:t xml:space="preserve"> dos hosts</w:t>
-                            </w:r>
-                            <w:r>
-                              <w:rPr>
-                                <w:sz w:val="16"/>
-                                <w:szCs w:val="14"/>
-                              </w:rPr>
-                              <w:t xml:space="preserve"> PPP-CHAP</w:t>
+                              <w:t xml:space="preserve"> dos hosts PPP-CHAP</w:t>
                             </w:r>
                           </w:p>
                         </w:txbxContent>
@@ -2968,12 +2942,14 @@
                                     <w:rPr>
                                       <w:sz w:val="16"/>
                                       <w:szCs w:val="14"/>
+                                      <w:highlight w:val="yellow"/>
                                     </w:rPr>
                                   </w:pPr>
                                   <w:r>
                                     <w:rPr>
                                       <w:sz w:val="16"/>
                                       <w:szCs w:val="14"/>
+                                      <w:highlight w:val="yellow"/>
                                     </w:rPr>
                                     <w:t>WAN</w:t>
                                   </w:r>
@@ -2982,6 +2958,7 @@
                                     <w:rPr>
                                       <w:sz w:val="16"/>
                                       <w:szCs w:val="14"/>
+                                      <w:highlight w:val="yellow"/>
                                     </w:rPr>
                                     <w:t>2 :</w:t>
                                   </w:r>
@@ -2990,6 +2967,7 @@
                                     <w:rPr>
                                       <w:sz w:val="16"/>
                                       <w:szCs w:val="14"/>
+                                      <w:highlight w:val="yellow"/>
                                     </w:rPr>
                                     <w:t xml:space="preserve"> dos hosts</w:t>
                                   </w:r>
@@ -3002,22 +2980,9 @@
                                     <w:rPr>
                                       <w:sz w:val="16"/>
                                       <w:szCs w:val="14"/>
+                                      <w:highlight w:val="yellow"/>
                                     </w:rPr>
-                                    <w:t>PPP</w:t>
-                                  </w:r>
-                                  <w:r>
-                                    <w:rPr>
-                                      <w:sz w:val="16"/>
-                                      <w:szCs w:val="14"/>
-                                    </w:rPr>
-                                    <w:t>-P</w:t>
-                                  </w:r>
-                                  <w:r>
-                                    <w:rPr>
-                                      <w:sz w:val="16"/>
-                                      <w:szCs w:val="14"/>
-                                    </w:rPr>
-                                    <w:t>AP</w:t>
+                                    <w:t>PPP-PAP</w:t>
                                   </w:r>
                                 </w:p>
                                 <w:p/>
@@ -3052,12 +3017,14 @@
                               <w:rPr>
                                 <w:sz w:val="16"/>
                                 <w:szCs w:val="14"/>
+                                <w:highlight w:val="yellow"/>
                               </w:rPr>
                             </w:pPr>
                             <w:r>
                               <w:rPr>
                                 <w:sz w:val="16"/>
                                 <w:szCs w:val="14"/>
+                                <w:highlight w:val="yellow"/>
                               </w:rPr>
                               <w:t>WAN</w:t>
                             </w:r>
@@ -3066,6 +3033,7 @@
                               <w:rPr>
                                 <w:sz w:val="16"/>
                                 <w:szCs w:val="14"/>
+                                <w:highlight w:val="yellow"/>
                               </w:rPr>
                               <w:t>2 :</w:t>
                             </w:r>
@@ -3074,6 +3042,7 @@
                               <w:rPr>
                                 <w:sz w:val="16"/>
                                 <w:szCs w:val="14"/>
+                                <w:highlight w:val="yellow"/>
                               </w:rPr>
                               <w:t xml:space="preserve"> dos hosts</w:t>
                             </w:r>
@@ -3086,22 +3055,9 @@
                               <w:rPr>
                                 <w:sz w:val="16"/>
                                 <w:szCs w:val="14"/>
+                                <w:highlight w:val="yellow"/>
                               </w:rPr>
-                              <w:t>PPP</w:t>
-                            </w:r>
-                            <w:r>
-                              <w:rPr>
-                                <w:sz w:val="16"/>
-                                <w:szCs w:val="14"/>
-                              </w:rPr>
-                              <w:t>-P</w:t>
-                            </w:r>
-                            <w:r>
-                              <w:rPr>
-                                <w:sz w:val="16"/>
-                                <w:szCs w:val="14"/>
-                              </w:rPr>
-                              <w:t>AP</w:t>
+                              <w:t>PPP-PAP</w:t>
                             </w:r>
                           </w:p>
                           <w:p/>
@@ -3157,12 +3113,14 @@
                                     <w:rPr>
                                       <w:sz w:val="16"/>
                                       <w:szCs w:val="14"/>
+                                      <w:highlight w:val="yellow"/>
                                     </w:rPr>
                                   </w:pPr>
                                   <w:r>
                                     <w:rPr>
                                       <w:sz w:val="16"/>
                                       <w:szCs w:val="14"/>
+                                      <w:highlight w:val="yellow"/>
                                     </w:rPr>
                                     <w:t>WAN</w:t>
                                   </w:r>
@@ -3171,6 +3129,7 @@
                                     <w:rPr>
                                       <w:sz w:val="16"/>
                                       <w:szCs w:val="14"/>
+                                      <w:highlight w:val="yellow"/>
                                     </w:rPr>
                                     <w:t>1 :</w:t>
                                   </w:r>
@@ -3179,6 +3138,7 @@
                                     <w:rPr>
                                       <w:sz w:val="16"/>
                                       <w:szCs w:val="14"/>
+                                      <w:highlight w:val="yellow"/>
                                     </w:rPr>
                                     <w:t xml:space="preserve"> dos hosts</w:t>
                                   </w:r>
@@ -3191,22 +3151,9 @@
                                     <w:rPr>
                                       <w:sz w:val="16"/>
                                       <w:szCs w:val="14"/>
+                                      <w:highlight w:val="yellow"/>
                                     </w:rPr>
-                                    <w:t>PPP</w:t>
-                                  </w:r>
-                                  <w:r>
-                                    <w:rPr>
-                                      <w:sz w:val="16"/>
-                                      <w:szCs w:val="14"/>
-                                    </w:rPr>
-                                    <w:t>-P</w:t>
-                                  </w:r>
-                                  <w:r>
-                                    <w:rPr>
-                                      <w:sz w:val="16"/>
-                                      <w:szCs w:val="14"/>
-                                    </w:rPr>
-                                    <w:t>AP</w:t>
+                                    <w:t>PPP-PAP</w:t>
                                   </w:r>
                                 </w:p>
                               </w:txbxContent>
@@ -3240,12 +3187,14 @@
                               <w:rPr>
                                 <w:sz w:val="16"/>
                                 <w:szCs w:val="14"/>
+                                <w:highlight w:val="yellow"/>
                               </w:rPr>
                             </w:pPr>
                             <w:r>
                               <w:rPr>
                                 <w:sz w:val="16"/>
                                 <w:szCs w:val="14"/>
+                                <w:highlight w:val="yellow"/>
                               </w:rPr>
                               <w:t>WAN</w:t>
                             </w:r>
@@ -3254,6 +3203,7 @@
                               <w:rPr>
                                 <w:sz w:val="16"/>
                                 <w:szCs w:val="14"/>
+                                <w:highlight w:val="yellow"/>
                               </w:rPr>
                               <w:t>1 :</w:t>
                             </w:r>
@@ -3262,6 +3212,7 @@
                               <w:rPr>
                                 <w:sz w:val="16"/>
                                 <w:szCs w:val="14"/>
+                                <w:highlight w:val="yellow"/>
                               </w:rPr>
                               <w:t xml:space="preserve"> dos hosts</w:t>
                             </w:r>
@@ -3274,22 +3225,9 @@
                               <w:rPr>
                                 <w:sz w:val="16"/>
                                 <w:szCs w:val="14"/>
+                                <w:highlight w:val="yellow"/>
                               </w:rPr>
-                              <w:t>PPP</w:t>
-                            </w:r>
-                            <w:r>
-                              <w:rPr>
-                                <w:sz w:val="16"/>
-                                <w:szCs w:val="14"/>
-                              </w:rPr>
-                              <w:t>-P</w:t>
-                            </w:r>
-                            <w:r>
-                              <w:rPr>
-                                <w:sz w:val="16"/>
-                                <w:szCs w:val="14"/>
-                              </w:rPr>
-                              <w:t>AP</w:t>
+                              <w:t>PPP-PAP</w:t>
                             </w:r>
                           </w:p>
                         </w:txbxContent>
@@ -3744,6 +3682,7 @@
                                     <w:rPr>
                                       <w:sz w:val="16"/>
                                       <w:szCs w:val="14"/>
+                                      <w:highlight w:val="yellow"/>
                                     </w:rPr>
                                     <w:t>WAN</w:t>
                                   </w:r>
@@ -3752,6 +3691,7 @@
                                     <w:rPr>
                                       <w:sz w:val="16"/>
                                       <w:szCs w:val="14"/>
+                                      <w:highlight w:val="yellow"/>
                                     </w:rPr>
                                     <w:t>6 :</w:t>
                                   </w:r>
@@ -3760,6 +3700,7 @@
                                     <w:rPr>
                                       <w:sz w:val="16"/>
                                       <w:szCs w:val="14"/>
+                                      <w:highlight w:val="yellow"/>
                                     </w:rPr>
                                     <w:t xml:space="preserve"> dos hosts</w:t>
                                   </w:r>
@@ -3772,22 +3713,9 @@
                                     <w:rPr>
                                       <w:sz w:val="16"/>
                                       <w:szCs w:val="14"/>
+                                      <w:highlight w:val="yellow"/>
                                     </w:rPr>
-                                    <w:t>PPP</w:t>
-                                  </w:r>
-                                  <w:r>
-                                    <w:rPr>
-                                      <w:sz w:val="16"/>
-                                      <w:szCs w:val="14"/>
-                                    </w:rPr>
-                                    <w:t>-P</w:t>
-                                  </w:r>
-                                  <w:r>
-                                    <w:rPr>
-                                      <w:sz w:val="16"/>
-                                      <w:szCs w:val="14"/>
-                                    </w:rPr>
-                                    <w:t>AP</w:t>
+                                    <w:t>PPP-PAP</w:t>
                                   </w:r>
                                 </w:p>
                               </w:txbxContent>
@@ -3827,6 +3755,7 @@
                               <w:rPr>
                                 <w:sz w:val="16"/>
                                 <w:szCs w:val="14"/>
+                                <w:highlight w:val="yellow"/>
                               </w:rPr>
                               <w:t>WAN</w:t>
                             </w:r>
@@ -3835,6 +3764,7 @@
                               <w:rPr>
                                 <w:sz w:val="16"/>
                                 <w:szCs w:val="14"/>
+                                <w:highlight w:val="yellow"/>
                               </w:rPr>
                               <w:t>6 :</w:t>
                             </w:r>
@@ -3843,6 +3773,7 @@
                               <w:rPr>
                                 <w:sz w:val="16"/>
                                 <w:szCs w:val="14"/>
+                                <w:highlight w:val="yellow"/>
                               </w:rPr>
                               <w:t xml:space="preserve"> dos hosts</w:t>
                             </w:r>
@@ -3855,22 +3786,9 @@
                               <w:rPr>
                                 <w:sz w:val="16"/>
                                 <w:szCs w:val="14"/>
+                                <w:highlight w:val="yellow"/>
                               </w:rPr>
-                              <w:t>PPP</w:t>
-                            </w:r>
-                            <w:r>
-                              <w:rPr>
-                                <w:sz w:val="16"/>
-                                <w:szCs w:val="14"/>
-                              </w:rPr>
-                              <w:t>-P</w:t>
-                            </w:r>
-                            <w:r>
-                              <w:rPr>
-                                <w:sz w:val="16"/>
-                                <w:szCs w:val="14"/>
-                              </w:rPr>
-                              <w:t>AP</w:t>
+                              <w:t>PPP-PAP</w:t>
                             </w:r>
                           </w:p>
                         </w:txbxContent>
@@ -4442,7 +4360,7 @@
                           <pic:cNvPicPr/>
                         </pic:nvPicPr>
                         <pic:blipFill>
-                          <a:blip r:embed="rId8">
+                          <a:blip r:embed="rId10">
                             <a:extLst>
                               <a:ext uri="{28A0092B-C50C-407E-A947-70E740481C1C}">
                                 <a14:useLocalDpi xmlns:a14="http://schemas.microsoft.com/office/drawing/2010/main" val="0"/>
@@ -5206,7 +5124,7 @@
           <w:szCs w:val="22"/>
         </w:rPr>
         <w:drawing>
-          <wp:inline distT="0" distB="0" distL="0" distR="0" wp14:anchorId="39608B76" wp14:editId="47D30B14">
+          <wp:inline distT="0" distB="0" distL="0" distR="0" wp14:anchorId="39608B76" wp14:editId="642AB405">
             <wp:extent cx="5662846" cy="2966253"/>
             <wp:effectExtent l="19050" t="19050" r="14605" b="24765"/>
             <wp:docPr id="810019701" name="Imagen 1" descr="Diagrama&#10;&#10;El contenido generado por IA puede ser incorrecto."/>
@@ -5221,7 +5139,7 @@
                     <pic:cNvPicPr/>
                   </pic:nvPicPr>
                   <pic:blipFill>
-                    <a:blip r:embed="rId9" cstate="print">
+                    <a:blip r:embed="rId11" cstate="print">
                       <a:extLst>
                         <a:ext uri="{28A0092B-C50C-407E-A947-70E740481C1C}">
                           <a14:useLocalDpi xmlns:a14="http://schemas.microsoft.com/office/drawing/2010/main" val="0"/>
@@ -5502,7 +5420,7 @@
     </w:p>
     <w:tbl>
       <w:tblPr>
-        <w:tblStyle w:val="Tablaconcuadrcula"/>
+        <w:tblStyle w:val="TableGrid"/>
         <w:tblW w:w="0" w:type="auto"/>
         <w:tblBorders>
           <w:top w:val="none" w:sz="0" w:space="0" w:color="auto"/>
@@ -5852,7 +5770,7 @@
           </w:tcPr>
           <w:p>
             <w:pPr>
-              <w:pStyle w:val="Prrafodelista"/>
+              <w:pStyle w:val="ListParagraph"/>
               <w:numPr>
                 <w:ilvl w:val="0"/>
                 <w:numId w:val="21"/>
@@ -5930,7 +5848,7 @@
           </w:tcPr>
           <w:p>
             <w:pPr>
-              <w:pStyle w:val="Prrafodelista"/>
+              <w:pStyle w:val="ListParagraph"/>
               <w:numPr>
                 <w:ilvl w:val="0"/>
                 <w:numId w:val="21"/>
@@ -6061,7 +5979,7 @@
     </w:p>
     <w:tbl>
       <w:tblPr>
-        <w:tblStyle w:val="Tablaconcuadrcula"/>
+        <w:tblStyle w:val="TableGrid"/>
         <w:tblW w:w="0" w:type="auto"/>
         <w:tblBorders>
           <w:top w:val="none" w:sz="0" w:space="0" w:color="auto"/>
@@ -6698,7 +6616,7 @@
                     </pic:cNvPicPr>
                   </pic:nvPicPr>
                   <pic:blipFill>
-                    <a:blip r:embed="rId10">
+                    <a:blip r:embed="rId12">
                       <a:extLst>
                         <a:ext uri="{28A0092B-C50C-407E-A947-70E740481C1C}">
                           <a14:useLocalDpi xmlns:a14="http://schemas.microsoft.com/office/drawing/2010/main" val="0"/>
@@ -6875,7 +6793,7 @@
                     </pic:cNvPicPr>
                   </pic:nvPicPr>
                   <pic:blipFill>
-                    <a:blip r:embed="rId11">
+                    <a:blip r:embed="rId13">
                       <a:extLst>
                         <a:ext uri="{28A0092B-C50C-407E-A947-70E740481C1C}">
                           <a14:useLocalDpi xmlns:a14="http://schemas.microsoft.com/office/drawing/2010/main" val="0"/>
@@ -6924,7 +6842,7 @@
           <w:u w:val="single"/>
         </w:rPr>
         <w:sectPr>
-          <w:footerReference w:type="default" r:id="rId12"/>
+          <w:footerReference w:type="default" r:id="rId14"/>
           <w:pgSz w:w="11907" w:h="16840" w:code="9"/>
           <w:pgMar w:top="1418" w:right="1418" w:bottom="1418" w:left="1418" w:header="709" w:footer="709" w:gutter="0"/>
           <w:cols w:space="708"/>
@@ -7192,7 +7110,7 @@
     </w:p>
     <w:p>
       <w:pPr>
-        <w:pStyle w:val="Prrafodelista"/>
+        <w:pStyle w:val="ListParagraph"/>
         <w:numPr>
           <w:ilvl w:val="0"/>
           <w:numId w:val="34"/>
@@ -7274,7 +7192,7 @@
     </w:p>
     <w:p>
       <w:pPr>
-        <w:pStyle w:val="Prrafodelista"/>
+        <w:pStyle w:val="ListParagraph"/>
         <w:numPr>
           <w:ilvl w:val="0"/>
           <w:numId w:val="34"/>
@@ -7348,7 +7266,7 @@
     </w:p>
     <w:p>
       <w:pPr>
-        <w:pStyle w:val="Prrafodelista"/>
+        <w:pStyle w:val="ListParagraph"/>
         <w:numPr>
           <w:ilvl w:val="0"/>
           <w:numId w:val="34"/>
@@ -7421,7 +7339,7 @@
     </w:p>
     <w:p>
       <w:pPr>
-        <w:pStyle w:val="Prrafodelista"/>
+        <w:pStyle w:val="ListParagraph"/>
         <w:numPr>
           <w:ilvl w:val="0"/>
           <w:numId w:val="34"/>
@@ -7494,7 +7412,7 @@
     </w:p>
     <w:p>
       <w:pPr>
-        <w:pStyle w:val="Prrafodelista"/>
+        <w:pStyle w:val="ListParagraph"/>
         <w:numPr>
           <w:ilvl w:val="0"/>
           <w:numId w:val="34"/>
@@ -7577,7 +7495,7 @@
     </w:p>
     <w:p>
       <w:pPr>
-        <w:pStyle w:val="Prrafodelista"/>
+        <w:pStyle w:val="ListParagraph"/>
         <w:numPr>
           <w:ilvl w:val="0"/>
           <w:numId w:val="34"/>
@@ -7650,7 +7568,7 @@
     </w:p>
     <w:p>
       <w:pPr>
-        <w:pStyle w:val="Prrafodelista"/>
+        <w:pStyle w:val="ListParagraph"/>
         <w:numPr>
           <w:ilvl w:val="0"/>
           <w:numId w:val="34"/>
@@ -7749,7 +7667,7 @@
     </w:p>
     <w:p>
       <w:pPr>
-        <w:pStyle w:val="Prrafodelista"/>
+        <w:pStyle w:val="ListParagraph"/>
         <w:numPr>
           <w:ilvl w:val="0"/>
           <w:numId w:val="39"/>
@@ -7823,7 +7741,7 @@
     </w:p>
     <w:p>
       <w:pPr>
-        <w:pStyle w:val="Prrafodelista"/>
+        <w:pStyle w:val="ListParagraph"/>
         <w:numPr>
           <w:ilvl w:val="0"/>
           <w:numId w:val="39"/>
@@ -8101,7 +8019,7 @@
                     </pic:cNvPicPr>
                   </pic:nvPicPr>
                   <pic:blipFill>
-                    <a:blip r:embed="rId13">
+                    <a:blip r:embed="rId15">
                       <a:extLst>
                         <a:ext uri="{28A0092B-C50C-407E-A947-70E740481C1C}">
                           <a14:useLocalDpi xmlns:a14="http://schemas.microsoft.com/office/drawing/2010/main" val="0"/>
@@ -8361,7 +8279,7 @@
     </w:p>
     <w:p>
       <w:pPr>
-        <w:pStyle w:val="Prrafodelista"/>
+        <w:pStyle w:val="ListParagraph"/>
         <w:numPr>
           <w:ilvl w:val="0"/>
           <w:numId w:val="35"/>
@@ -8482,7 +8400,7 @@
     </w:p>
     <w:p>
       <w:pPr>
-        <w:pStyle w:val="Prrafodelista"/>
+        <w:pStyle w:val="ListParagraph"/>
         <w:numPr>
           <w:ilvl w:val="0"/>
           <w:numId w:val="35"/>
@@ -8603,7 +8521,7 @@
     </w:p>
     <w:p>
       <w:pPr>
-        <w:pStyle w:val="Prrafodelista"/>
+        <w:pStyle w:val="ListParagraph"/>
         <w:numPr>
           <w:ilvl w:val="0"/>
           <w:numId w:val="35"/>
@@ -8724,7 +8642,7 @@
     </w:p>
     <w:p>
       <w:pPr>
-        <w:pStyle w:val="Prrafodelista"/>
+        <w:pStyle w:val="ListParagraph"/>
         <w:numPr>
           <w:ilvl w:val="0"/>
           <w:numId w:val="35"/>
@@ -8791,7 +8709,7 @@
     </w:p>
     <w:p>
       <w:pPr>
-        <w:pStyle w:val="Prrafodelista"/>
+        <w:pStyle w:val="ListParagraph"/>
         <w:numPr>
           <w:ilvl w:val="0"/>
           <w:numId w:val="37"/>
@@ -9385,7 +9303,7 @@
     </w:p>
     <w:p>
       <w:pPr>
-        <w:pStyle w:val="Prrafodelista"/>
+        <w:pStyle w:val="ListParagraph"/>
         <w:numPr>
           <w:ilvl w:val="0"/>
           <w:numId w:val="37"/>
@@ -9529,7 +9447,7 @@
     </w:p>
     <w:p>
       <w:pPr>
-        <w:pStyle w:val="Prrafodelista"/>
+        <w:pStyle w:val="ListParagraph"/>
         <w:numPr>
           <w:ilvl w:val="0"/>
           <w:numId w:val="37"/>
@@ -9703,7 +9621,7 @@
     </w:p>
     <w:p>
       <w:pPr>
-        <w:pStyle w:val="Prrafodelista"/>
+        <w:pStyle w:val="ListParagraph"/>
         <w:numPr>
           <w:ilvl w:val="0"/>
           <w:numId w:val="16"/>
@@ -9749,7 +9667,18 @@
           <w:sz w:val="22"/>
           <w:szCs w:val="22"/>
         </w:rPr>
-        <w:t xml:space="preserve">) que solo debe ser accedido por los usuarios de su sede local y además acceder al servidor de archivos de la sede principal </w:t>
+        <w:t xml:space="preserve">) que solo debe ser accedido por los </w:t>
+      </w:r>
+      <w:r>
+        <w:rPr>
+          <w:rFonts w:eastAsia="Calibri"/>
+          <w:bCs/>
+          <w:color w:val="000000"/>
+          <w:sz w:val="22"/>
+          <w:szCs w:val="22"/>
+          <w:highlight w:val="yellow"/>
+        </w:rPr>
+        <w:t xml:space="preserve">usuarios de su sede local y además acceder al servidor de archivos de la sede principal </w:t>
       </w:r>
       <w:r>
         <w:rPr>
@@ -9759,6 +9688,7 @@
           <w:color w:val="000000"/>
           <w:sz w:val="22"/>
           <w:szCs w:val="22"/>
+          <w:highlight w:val="yellow"/>
         </w:rPr>
         <w:t>Lima</w:t>
       </w:r>
@@ -9769,6 +9699,7 @@
           <w:color w:val="000000"/>
           <w:sz w:val="22"/>
           <w:szCs w:val="22"/>
+          <w:highlight w:val="yellow"/>
         </w:rPr>
         <w:t xml:space="preserve"> (Por ejemplo, los usuarios de la sede sucursal </w:t>
       </w:r>
@@ -9780,6 +9711,7 @@
           <w:color w:val="000000"/>
           <w:sz w:val="22"/>
           <w:szCs w:val="22"/>
+          <w:highlight w:val="yellow"/>
         </w:rPr>
         <w:t>Ica</w:t>
       </w:r>
@@ -9790,6 +9722,7 @@
           <w:color w:val="000000"/>
           <w:sz w:val="22"/>
           <w:szCs w:val="22"/>
+          <w:highlight w:val="yellow"/>
         </w:rPr>
         <w:t xml:space="preserve"> solo podrán visitar el servidor de archivos de la sede principal </w:t>
       </w:r>
@@ -9801,6 +9734,7 @@
           <w:color w:val="000000"/>
           <w:sz w:val="22"/>
           <w:szCs w:val="22"/>
+          <w:highlight w:val="yellow"/>
         </w:rPr>
         <w:t>Lima</w:t>
       </w:r>
@@ -9811,6 +9745,7 @@
           <w:color w:val="000000"/>
           <w:sz w:val="22"/>
           <w:szCs w:val="22"/>
+          <w:highlight w:val="yellow"/>
         </w:rPr>
         <w:t xml:space="preserve"> y al servidor local de </w:t>
       </w:r>
@@ -9822,6 +9757,7 @@
           <w:color w:val="000000"/>
           <w:sz w:val="22"/>
           <w:szCs w:val="22"/>
+          <w:highlight w:val="yellow"/>
         </w:rPr>
         <w:t>Ica</w:t>
       </w:r>
@@ -9832,6 +9768,7 @@
           <w:color w:val="000000"/>
           <w:sz w:val="22"/>
           <w:szCs w:val="22"/>
+          <w:highlight w:val="yellow"/>
         </w:rPr>
         <w:t xml:space="preserve"> mas no </w:t>
       </w:r>
@@ -9843,6 +9780,7 @@
           <w:color w:val="000000"/>
           <w:sz w:val="22"/>
           <w:szCs w:val="22"/>
+          <w:highlight w:val="yellow"/>
         </w:rPr>
         <w:t>La Libertad</w:t>
       </w:r>
@@ -9853,6 +9791,7 @@
           <w:color w:val="000000"/>
           <w:sz w:val="22"/>
           <w:szCs w:val="22"/>
+          <w:highlight w:val="yellow"/>
         </w:rPr>
         <w:t xml:space="preserve"> y otras sedes; otro ejemplo, los usuarios de </w:t>
       </w:r>
@@ -9864,6 +9803,7 @@
           <w:color w:val="000000"/>
           <w:sz w:val="22"/>
           <w:szCs w:val="22"/>
+          <w:highlight w:val="yellow"/>
         </w:rPr>
         <w:t>La Libertad</w:t>
       </w:r>
@@ -9874,6 +9814,7 @@
           <w:color w:val="000000"/>
           <w:sz w:val="22"/>
           <w:szCs w:val="22"/>
+          <w:highlight w:val="yellow"/>
         </w:rPr>
         <w:t xml:space="preserve"> podrán visitar el servidor de archivos de </w:t>
       </w:r>
@@ -9885,6 +9826,7 @@
           <w:color w:val="000000"/>
           <w:sz w:val="22"/>
           <w:szCs w:val="22"/>
+          <w:highlight w:val="yellow"/>
         </w:rPr>
         <w:t>Lima</w:t>
       </w:r>
@@ -9895,6 +9837,7 @@
           <w:color w:val="000000"/>
           <w:sz w:val="22"/>
           <w:szCs w:val="22"/>
+          <w:highlight w:val="yellow"/>
         </w:rPr>
         <w:t xml:space="preserve"> y </w:t>
       </w:r>
@@ -9906,6 +9849,7 @@
           <w:color w:val="000000"/>
           <w:sz w:val="22"/>
           <w:szCs w:val="22"/>
+          <w:highlight w:val="yellow"/>
         </w:rPr>
         <w:t>La Libertad</w:t>
       </w:r>
@@ -9916,6 +9860,7 @@
           <w:color w:val="000000"/>
           <w:sz w:val="22"/>
           <w:szCs w:val="22"/>
+          <w:highlight w:val="yellow"/>
         </w:rPr>
         <w:t xml:space="preserve"> más no el de </w:t>
       </w:r>
@@ -9927,6 +9872,7 @@
           <w:color w:val="000000"/>
           <w:sz w:val="22"/>
           <w:szCs w:val="22"/>
+          <w:highlight w:val="yellow"/>
         </w:rPr>
         <w:t>Ica</w:t>
       </w:r>
@@ -9937,13 +9883,14 @@
           <w:color w:val="000000"/>
           <w:sz w:val="22"/>
           <w:szCs w:val="22"/>
+          <w:highlight w:val="yellow"/>
         </w:rPr>
         <w:t xml:space="preserve"> y otras sedes).</w:t>
       </w:r>
     </w:p>
     <w:p>
       <w:pPr>
-        <w:pStyle w:val="Prrafodelista"/>
+        <w:pStyle w:val="ListParagraph"/>
         <w:numPr>
           <w:ilvl w:val="0"/>
           <w:numId w:val="16"/>
@@ -10025,7 +9972,7 @@
     </w:p>
     <w:p>
       <w:pPr>
-        <w:pStyle w:val="Prrafodelista"/>
+        <w:pStyle w:val="ListParagraph"/>
         <w:numPr>
           <w:ilvl w:val="0"/>
           <w:numId w:val="16"/>
@@ -10041,15 +9988,17 @@
           <w:color w:val="000000"/>
           <w:sz w:val="22"/>
           <w:szCs w:val="22"/>
-        </w:rPr>
-      </w:pPr>
-      <w:r>
-        <w:rPr>
-          <w:rFonts w:eastAsia="Calibri"/>
-          <w:bCs/>
-          <w:color w:val="000000"/>
-          <w:sz w:val="22"/>
-          <w:szCs w:val="22"/>
+          <w:highlight w:val="yellow"/>
+        </w:rPr>
+      </w:pPr>
+      <w:r>
+        <w:rPr>
+          <w:rFonts w:eastAsia="Calibri"/>
+          <w:bCs/>
+          <w:color w:val="000000"/>
+          <w:sz w:val="22"/>
+          <w:szCs w:val="22"/>
+          <w:highlight w:val="yellow"/>
         </w:rPr>
         <w:t xml:space="preserve">La sede </w:t>
       </w:r>
@@ -10061,6 +10010,7 @@
           <w:color w:val="000000"/>
           <w:sz w:val="22"/>
           <w:szCs w:val="22"/>
+          <w:highlight w:val="yellow"/>
         </w:rPr>
         <w:t>Lima</w:t>
       </w:r>
@@ -10071,6 +10021,7 @@
           <w:color w:val="000000"/>
           <w:sz w:val="22"/>
           <w:szCs w:val="22"/>
+          <w:highlight w:val="yellow"/>
         </w:rPr>
         <w:t xml:space="preserve"> y las 4 sedes sucursales también implementaran un </w:t>
       </w:r>
@@ -10081,6 +10032,7 @@
           <w:color w:val="000000"/>
           <w:sz w:val="22"/>
           <w:szCs w:val="22"/>
+          <w:highlight w:val="yellow"/>
         </w:rPr>
         <w:t>servidor DHCP</w:t>
       </w:r>
@@ -10091,13 +10043,14 @@
           <w:color w:val="000000"/>
           <w:sz w:val="22"/>
           <w:szCs w:val="22"/>
+          <w:highlight w:val="yellow"/>
         </w:rPr>
         <w:t xml:space="preserve"> local, que puede ser visitado por cualquier usuario de la empresa.</w:t>
       </w:r>
     </w:p>
     <w:p>
       <w:pPr>
-        <w:pStyle w:val="Prrafodelista"/>
+        <w:pStyle w:val="ListParagraph"/>
         <w:numPr>
           <w:ilvl w:val="0"/>
           <w:numId w:val="16"/>
@@ -10179,7 +10132,7 @@
     </w:p>
     <w:p>
       <w:pPr>
-        <w:pStyle w:val="Prrafodelista"/>
+        <w:pStyle w:val="ListParagraph"/>
         <w:numPr>
           <w:ilvl w:val="0"/>
           <w:numId w:val="16"/>
@@ -10328,7 +10281,7 @@
     </w:p>
     <w:p>
       <w:pPr>
-        <w:pStyle w:val="Prrafodelista"/>
+        <w:pStyle w:val="ListParagraph"/>
         <w:numPr>
           <w:ilvl w:val="0"/>
           <w:numId w:val="37"/>
@@ -10620,7 +10573,7 @@
     </w:p>
     <w:p>
       <w:pPr>
-        <w:pStyle w:val="Prrafodelista"/>
+        <w:pStyle w:val="ListParagraph"/>
         <w:numPr>
           <w:ilvl w:val="0"/>
           <w:numId w:val="37"/>
@@ -10957,7 +10910,7 @@
     </w:p>
     <w:p>
       <w:pPr>
-        <w:pStyle w:val="Prrafodelista"/>
+        <w:pStyle w:val="ListParagraph"/>
         <w:numPr>
           <w:ilvl w:val="0"/>
           <w:numId w:val="17"/>
@@ -11353,7 +11306,7 @@
     </w:p>
     <w:p>
       <w:pPr>
-        <w:pStyle w:val="Prrafodelista"/>
+        <w:pStyle w:val="ListParagraph"/>
         <w:numPr>
           <w:ilvl w:val="0"/>
           <w:numId w:val="17"/>
@@ -12680,7 +12633,7 @@
     </w:p>
     <w:p>
       <w:pPr>
-        <w:pStyle w:val="Prrafodelista"/>
+        <w:pStyle w:val="ListParagraph"/>
         <w:numPr>
           <w:ilvl w:val="0"/>
           <w:numId w:val="17"/>
@@ -13004,7 +12957,7 @@
     </w:p>
     <w:p>
       <w:pPr>
-        <w:pStyle w:val="Prrafodelista"/>
+        <w:pStyle w:val="ListParagraph"/>
         <w:numPr>
           <w:ilvl w:val="0"/>
           <w:numId w:val="28"/>
@@ -13109,7 +13062,7 @@
     </w:p>
     <w:p>
       <w:pPr>
-        <w:pStyle w:val="Prrafodelista"/>
+        <w:pStyle w:val="ListParagraph"/>
         <w:numPr>
           <w:ilvl w:val="0"/>
           <w:numId w:val="28"/>
@@ -13138,7 +13091,7 @@
     </w:p>
     <w:p>
       <w:pPr>
-        <w:pStyle w:val="Prrafodelista"/>
+        <w:pStyle w:val="ListParagraph"/>
         <w:numPr>
           <w:ilvl w:val="0"/>
           <w:numId w:val="28"/>
@@ -13167,7 +13120,7 @@
     </w:p>
     <w:p>
       <w:pPr>
-        <w:pStyle w:val="Prrafodelista"/>
+        <w:pStyle w:val="ListParagraph"/>
         <w:numPr>
           <w:ilvl w:val="0"/>
           <w:numId w:val="28"/>
@@ -13281,7 +13234,7 @@
     </w:p>
     <w:p>
       <w:pPr>
-        <w:pStyle w:val="Prrafodelista"/>
+        <w:pStyle w:val="ListParagraph"/>
         <w:numPr>
           <w:ilvl w:val="0"/>
           <w:numId w:val="27"/>
@@ -13389,7 +13342,7 @@
     </w:p>
     <w:p>
       <w:pPr>
-        <w:pStyle w:val="Prrafodelista"/>
+        <w:pStyle w:val="ListParagraph"/>
         <w:numPr>
           <w:ilvl w:val="0"/>
           <w:numId w:val="17"/>
@@ -13413,7 +13366,7 @@
     </w:p>
     <w:p>
       <w:pPr>
-        <w:pStyle w:val="Prrafodelista"/>
+        <w:pStyle w:val="ListParagraph"/>
         <w:numPr>
           <w:ilvl w:val="0"/>
           <w:numId w:val="17"/>
@@ -13455,7 +13408,7 @@
     </w:p>
     <w:p>
       <w:pPr>
-        <w:pStyle w:val="Prrafodelista"/>
+        <w:pStyle w:val="ListParagraph"/>
         <w:numPr>
           <w:ilvl w:val="0"/>
           <w:numId w:val="17"/>
@@ -13479,7 +13432,7 @@
     </w:p>
     <w:p>
       <w:pPr>
-        <w:pStyle w:val="Prrafodelista"/>
+        <w:pStyle w:val="ListParagraph"/>
         <w:numPr>
           <w:ilvl w:val="0"/>
           <w:numId w:val="17"/>
@@ -13525,7 +13478,7 @@
     </w:p>
     <w:p>
       <w:pPr>
-        <w:pStyle w:val="Prrafodelista"/>
+        <w:pStyle w:val="ListParagraph"/>
         <w:numPr>
           <w:ilvl w:val="0"/>
           <w:numId w:val="22"/>
@@ -13567,7 +13520,7 @@
     </w:p>
     <w:p>
       <w:pPr>
-        <w:pStyle w:val="Prrafodelista"/>
+        <w:pStyle w:val="ListParagraph"/>
         <w:numPr>
           <w:ilvl w:val="0"/>
           <w:numId w:val="22"/>
@@ -13631,7 +13584,7 @@
     </w:p>
     <w:p>
       <w:pPr>
-        <w:pStyle w:val="Prrafodelista"/>
+        <w:pStyle w:val="ListParagraph"/>
         <w:numPr>
           <w:ilvl w:val="0"/>
           <w:numId w:val="23"/>
@@ -13673,7 +13626,7 @@
     </w:p>
     <w:p>
       <w:pPr>
-        <w:pStyle w:val="Prrafodelista"/>
+        <w:pStyle w:val="ListParagraph"/>
         <w:numPr>
           <w:ilvl w:val="0"/>
           <w:numId w:val="23"/>
@@ -13705,7 +13658,7 @@
     </w:p>
     <w:p>
       <w:pPr>
-        <w:pStyle w:val="Prrafodelista"/>
+        <w:pStyle w:val="ListParagraph"/>
         <w:ind w:left="1080"/>
         <w:rPr>
           <w:color w:val="000000"/>
@@ -13738,7 +13691,7 @@
     </w:p>
     <w:p>
       <w:pPr>
-        <w:pStyle w:val="Prrafodelista"/>
+        <w:pStyle w:val="ListParagraph"/>
         <w:numPr>
           <w:ilvl w:val="0"/>
           <w:numId w:val="24"/>
@@ -13762,7 +13715,7 @@
     </w:p>
     <w:p>
       <w:pPr>
-        <w:pStyle w:val="Prrafodelista"/>
+        <w:pStyle w:val="ListParagraph"/>
         <w:numPr>
           <w:ilvl w:val="0"/>
           <w:numId w:val="24"/>
@@ -13804,7 +13757,7 @@
     </w:p>
     <w:p>
       <w:pPr>
-        <w:pStyle w:val="Prrafodelista"/>
+        <w:pStyle w:val="ListParagraph"/>
         <w:numPr>
           <w:ilvl w:val="0"/>
           <w:numId w:val="24"/>
@@ -13828,7 +13781,7 @@
     </w:p>
     <w:p>
       <w:pPr>
-        <w:pStyle w:val="Prrafodelista"/>
+        <w:pStyle w:val="ListParagraph"/>
         <w:numPr>
           <w:ilvl w:val="0"/>
           <w:numId w:val="24"/>
@@ -13900,7 +13853,7 @@
     </w:p>
     <w:p>
       <w:pPr>
-        <w:pStyle w:val="Prrafodelista"/>
+        <w:pStyle w:val="ListParagraph"/>
         <w:numPr>
           <w:ilvl w:val="0"/>
           <w:numId w:val="25"/>
@@ -13996,7 +13949,7 @@
     </w:p>
     <w:p>
       <w:pPr>
-        <w:pStyle w:val="Prrafodelista"/>
+        <w:pStyle w:val="ListParagraph"/>
         <w:numPr>
           <w:ilvl w:val="0"/>
           <w:numId w:val="25"/>
@@ -14046,7 +13999,7 @@
     </w:p>
     <w:p>
       <w:pPr>
-        <w:pStyle w:val="Prrafodelista"/>
+        <w:pStyle w:val="ListParagraph"/>
         <w:numPr>
           <w:ilvl w:val="0"/>
           <w:numId w:val="25"/>
@@ -14113,7 +14066,7 @@
     </w:p>
     <w:p>
       <w:pPr>
-        <w:pStyle w:val="Prrafodelista"/>
+        <w:pStyle w:val="ListParagraph"/>
         <w:numPr>
           <w:ilvl w:val="0"/>
           <w:numId w:val="25"/>
@@ -14155,7 +14108,7 @@
     </w:p>
     <w:p>
       <w:pPr>
-        <w:pStyle w:val="Prrafodelista"/>
+        <w:pStyle w:val="ListParagraph"/>
         <w:numPr>
           <w:ilvl w:val="0"/>
           <w:numId w:val="25"/>
@@ -14215,7 +14168,7 @@
     </w:p>
     <w:p>
       <w:pPr>
-        <w:pStyle w:val="Prrafodelista"/>
+        <w:pStyle w:val="ListParagraph"/>
         <w:numPr>
           <w:ilvl w:val="0"/>
           <w:numId w:val="25"/>
@@ -14261,7 +14214,7 @@
     </w:p>
     <w:p>
       <w:pPr>
-        <w:pStyle w:val="Prrafodelista"/>
+        <w:pStyle w:val="ListParagraph"/>
         <w:numPr>
           <w:ilvl w:val="0"/>
           <w:numId w:val="26"/>
@@ -14321,7 +14274,7 @@
     </w:p>
     <w:p>
       <w:pPr>
-        <w:pStyle w:val="Prrafodelista"/>
+        <w:pStyle w:val="ListParagraph"/>
         <w:numPr>
           <w:ilvl w:val="0"/>
           <w:numId w:val="26"/>
@@ -14345,7 +14298,7 @@
     </w:p>
     <w:p>
       <w:pPr>
-        <w:pStyle w:val="Prrafodelista"/>
+        <w:pStyle w:val="ListParagraph"/>
         <w:numPr>
           <w:ilvl w:val="0"/>
           <w:numId w:val="26"/>
@@ -14369,7 +14322,7 @@
     </w:p>
     <w:p>
       <w:pPr>
-        <w:pStyle w:val="Prrafodelista"/>
+        <w:pStyle w:val="ListParagraph"/>
         <w:numPr>
           <w:ilvl w:val="0"/>
           <w:numId w:val="26"/>
@@ -14430,7 +14383,7 @@
     </w:p>
     <w:p>
       <w:pPr>
-        <w:pStyle w:val="Prrafodelista"/>
+        <w:pStyle w:val="ListParagraph"/>
         <w:numPr>
           <w:ilvl w:val="0"/>
           <w:numId w:val="26"/>
@@ -14496,7 +14449,7 @@
     </w:p>
     <w:p>
       <w:pPr>
-        <w:pStyle w:val="Prrafodelista"/>
+        <w:pStyle w:val="ListParagraph"/>
         <w:numPr>
           <w:ilvl w:val="0"/>
           <w:numId w:val="26"/>
@@ -14520,7 +14473,7 @@
     </w:p>
     <w:p>
       <w:pPr>
-        <w:pStyle w:val="Prrafodelista"/>
+        <w:pStyle w:val="ListParagraph"/>
         <w:numPr>
           <w:ilvl w:val="0"/>
           <w:numId w:val="26"/>
@@ -14544,7 +14497,7 @@
     </w:p>
     <w:p>
       <w:pPr>
-        <w:pStyle w:val="Prrafodelista"/>
+        <w:pStyle w:val="ListParagraph"/>
         <w:numPr>
           <w:ilvl w:val="0"/>
           <w:numId w:val="26"/>
@@ -14574,7 +14527,7 @@
     </w:p>
     <w:p>
       <w:pPr>
-        <w:pStyle w:val="Prrafodelista"/>
+        <w:pStyle w:val="ListParagraph"/>
         <w:numPr>
           <w:ilvl w:val="0"/>
           <w:numId w:val="26"/>
@@ -14671,7 +14624,7 @@
     </w:p>
     <w:p>
       <w:pPr>
-        <w:pStyle w:val="Prrafodelista"/>
+        <w:pStyle w:val="ListParagraph"/>
         <w:numPr>
           <w:ilvl w:val="0"/>
           <w:numId w:val="17"/>
@@ -14724,7 +14677,7 @@
     </w:p>
     <w:p>
       <w:pPr>
-        <w:pStyle w:val="Prrafodelista"/>
+        <w:pStyle w:val="ListParagraph"/>
         <w:numPr>
           <w:ilvl w:val="0"/>
           <w:numId w:val="17"/>
@@ -14755,7 +14708,7 @@
     </w:p>
     <w:p>
       <w:pPr>
-        <w:pStyle w:val="Prrafodelista"/>
+        <w:pStyle w:val="ListParagraph"/>
         <w:numPr>
           <w:ilvl w:val="0"/>
           <w:numId w:val="17"/>
@@ -14786,7 +14739,7 @@
     </w:p>
     <w:p>
       <w:pPr>
-        <w:pStyle w:val="Prrafodelista"/>
+        <w:pStyle w:val="ListParagraph"/>
         <w:numPr>
           <w:ilvl w:val="0"/>
           <w:numId w:val="17"/>
@@ -15053,7 +15006,7 @@
     </w:p>
     <w:p>
       <w:pPr>
-        <w:pStyle w:val="Prrafodelista"/>
+        <w:pStyle w:val="ListParagraph"/>
         <w:numPr>
           <w:ilvl w:val="0"/>
           <w:numId w:val="28"/>
@@ -15158,7 +15111,7 @@
     </w:p>
     <w:p>
       <w:pPr>
-        <w:pStyle w:val="Prrafodelista"/>
+        <w:pStyle w:val="ListParagraph"/>
         <w:numPr>
           <w:ilvl w:val="0"/>
           <w:numId w:val="28"/>
@@ -15187,7 +15140,7 @@
     </w:p>
     <w:p>
       <w:pPr>
-        <w:pStyle w:val="Prrafodelista"/>
+        <w:pStyle w:val="ListParagraph"/>
         <w:numPr>
           <w:ilvl w:val="0"/>
           <w:numId w:val="28"/>
@@ -15216,7 +15169,7 @@
     </w:p>
     <w:p>
       <w:pPr>
-        <w:pStyle w:val="Prrafodelista"/>
+        <w:pStyle w:val="ListParagraph"/>
         <w:numPr>
           <w:ilvl w:val="0"/>
           <w:numId w:val="28"/>
@@ -15330,7 +15283,7 @@
     </w:p>
     <w:p>
       <w:pPr>
-        <w:pStyle w:val="Prrafodelista"/>
+        <w:pStyle w:val="ListParagraph"/>
         <w:numPr>
           <w:ilvl w:val="0"/>
           <w:numId w:val="27"/>
@@ -15437,7 +15390,7 @@
     </w:p>
     <w:p>
       <w:pPr>
-        <w:pStyle w:val="Prrafodelista"/>
+        <w:pStyle w:val="ListParagraph"/>
         <w:numPr>
           <w:ilvl w:val="0"/>
           <w:numId w:val="30"/>
@@ -15478,7 +15431,7 @@
     </w:p>
     <w:p>
       <w:pPr>
-        <w:pStyle w:val="Prrafodelista"/>
+        <w:pStyle w:val="ListParagraph"/>
         <w:numPr>
           <w:ilvl w:val="0"/>
           <w:numId w:val="30"/>
@@ -15519,7 +15472,7 @@
     </w:p>
     <w:p>
       <w:pPr>
-        <w:pStyle w:val="Prrafodelista"/>
+        <w:pStyle w:val="ListParagraph"/>
         <w:numPr>
           <w:ilvl w:val="0"/>
           <w:numId w:val="30"/>
@@ -15543,7 +15496,7 @@
     </w:p>
     <w:p>
       <w:pPr>
-        <w:pStyle w:val="Prrafodelista"/>
+        <w:pStyle w:val="ListParagraph"/>
         <w:numPr>
           <w:ilvl w:val="0"/>
           <w:numId w:val="30"/>
@@ -15576,7 +15529,7 @@
     </w:p>
     <w:p>
       <w:pPr>
-        <w:pStyle w:val="Prrafodelista"/>
+        <w:pStyle w:val="ListParagraph"/>
         <w:numPr>
           <w:ilvl w:val="0"/>
           <w:numId w:val="30"/>
@@ -15631,7 +15584,7 @@
     </w:p>
     <w:p>
       <w:pPr>
-        <w:pStyle w:val="Prrafodelista"/>
+        <w:pStyle w:val="ListParagraph"/>
         <w:numPr>
           <w:ilvl w:val="0"/>
           <w:numId w:val="27"/>
@@ -15672,7 +15625,7 @@
     </w:p>
     <w:p>
       <w:pPr>
-        <w:pStyle w:val="Prrafodelista"/>
+        <w:pStyle w:val="ListParagraph"/>
         <w:numPr>
           <w:ilvl w:val="0"/>
           <w:numId w:val="27"/>
@@ -15713,7 +15666,7 @@
     </w:p>
     <w:p>
       <w:pPr>
-        <w:pStyle w:val="Prrafodelista"/>
+        <w:pStyle w:val="ListParagraph"/>
         <w:numPr>
           <w:ilvl w:val="0"/>
           <w:numId w:val="27"/>
@@ -15754,7 +15707,7 @@
     </w:p>
     <w:p>
       <w:pPr>
-        <w:pStyle w:val="Prrafodelista"/>
+        <w:pStyle w:val="ListParagraph"/>
         <w:numPr>
           <w:ilvl w:val="0"/>
           <w:numId w:val="27"/>
@@ -15795,7 +15748,7 @@
     </w:p>
     <w:p>
       <w:pPr>
-        <w:pStyle w:val="Prrafodelista"/>
+        <w:pStyle w:val="ListParagraph"/>
         <w:numPr>
           <w:ilvl w:val="0"/>
           <w:numId w:val="27"/>
@@ -15836,7 +15789,7 @@
     </w:p>
     <w:p>
       <w:pPr>
-        <w:pStyle w:val="Prrafodelista"/>
+        <w:pStyle w:val="ListParagraph"/>
         <w:numPr>
           <w:ilvl w:val="0"/>
           <w:numId w:val="27"/>
@@ -15885,7 +15838,7 @@
     </w:p>
     <w:p>
       <w:pPr>
-        <w:pStyle w:val="Prrafodelista"/>
+        <w:pStyle w:val="ListParagraph"/>
         <w:numPr>
           <w:ilvl w:val="0"/>
           <w:numId w:val="27"/>
@@ -15934,7 +15887,7 @@
     </w:p>
     <w:p>
       <w:pPr>
-        <w:pStyle w:val="Prrafodelista"/>
+        <w:pStyle w:val="ListParagraph"/>
         <w:numPr>
           <w:ilvl w:val="0"/>
           <w:numId w:val="27"/>
@@ -15989,7 +15942,7 @@
     </w:p>
     <w:p>
       <w:pPr>
-        <w:pStyle w:val="Prrafodelista"/>
+        <w:pStyle w:val="ListParagraph"/>
         <w:numPr>
           <w:ilvl w:val="0"/>
           <w:numId w:val="33"/>
@@ -16012,7 +15965,7 @@
     </w:p>
     <w:p>
       <w:pPr>
-        <w:pStyle w:val="Prrafodelista"/>
+        <w:pStyle w:val="ListParagraph"/>
         <w:numPr>
           <w:ilvl w:val="0"/>
           <w:numId w:val="33"/>
@@ -16035,7 +15988,7 @@
     </w:p>
     <w:p>
       <w:pPr>
-        <w:pStyle w:val="Prrafodelista"/>
+        <w:pStyle w:val="ListParagraph"/>
         <w:numPr>
           <w:ilvl w:val="0"/>
           <w:numId w:val="33"/>
@@ -16058,7 +16011,7 @@
     </w:p>
     <w:p>
       <w:pPr>
-        <w:pStyle w:val="Prrafodelista"/>
+        <w:pStyle w:val="ListParagraph"/>
         <w:numPr>
           <w:ilvl w:val="0"/>
           <w:numId w:val="33"/>
@@ -16089,7 +16042,7 @@
     </w:p>
     <w:p>
       <w:pPr>
-        <w:pStyle w:val="Prrafodelista"/>
+        <w:pStyle w:val="ListParagraph"/>
         <w:numPr>
           <w:ilvl w:val="0"/>
           <w:numId w:val="33"/>
@@ -16120,7 +16073,7 @@
     </w:p>
     <w:p>
       <w:pPr>
-        <w:pStyle w:val="Prrafodelista"/>
+        <w:pStyle w:val="ListParagraph"/>
         <w:rPr>
           <w:color w:val="000000"/>
           <w:sz w:val="22"/>
@@ -16151,7 +16104,7 @@
     </w:p>
     <w:p>
       <w:pPr>
-        <w:pStyle w:val="Prrafodelista"/>
+        <w:pStyle w:val="ListParagraph"/>
         <w:numPr>
           <w:ilvl w:val="0"/>
           <w:numId w:val="32"/>
@@ -16174,7 +16127,7 @@
     </w:p>
     <w:p>
       <w:pPr>
-        <w:pStyle w:val="Prrafodelista"/>
+        <w:pStyle w:val="ListParagraph"/>
         <w:numPr>
           <w:ilvl w:val="0"/>
           <w:numId w:val="32"/>
@@ -16197,7 +16150,7 @@
     </w:p>
     <w:p>
       <w:pPr>
-        <w:pStyle w:val="Prrafodelista"/>
+        <w:pStyle w:val="ListParagraph"/>
         <w:numPr>
           <w:ilvl w:val="0"/>
           <w:numId w:val="32"/>
@@ -16252,7 +16205,7 @@
     </w:p>
     <w:p>
       <w:pPr>
-        <w:pStyle w:val="Prrafodelista"/>
+        <w:pStyle w:val="ListParagraph"/>
         <w:numPr>
           <w:ilvl w:val="0"/>
           <w:numId w:val="32"/>
@@ -16375,7 +16328,7 @@
     </w:p>
     <w:p>
       <w:pPr>
-        <w:pStyle w:val="Prrafodelista"/>
+        <w:pStyle w:val="ListParagraph"/>
         <w:numPr>
           <w:ilvl w:val="0"/>
           <w:numId w:val="32"/>
@@ -16430,7 +16383,7 @@
     </w:p>
     <w:p>
       <w:pPr>
-        <w:pStyle w:val="Prrafodelista"/>
+        <w:pStyle w:val="ListParagraph"/>
         <w:numPr>
           <w:ilvl w:val="1"/>
           <w:numId w:val="32"/>
@@ -16453,7 +16406,7 @@
     </w:p>
     <w:p>
       <w:pPr>
-        <w:pStyle w:val="Prrafodelista"/>
+        <w:pStyle w:val="ListParagraph"/>
         <w:numPr>
           <w:ilvl w:val="1"/>
           <w:numId w:val="32"/>
@@ -16518,7 +16471,7 @@
     </w:p>
     <w:p>
       <w:pPr>
-        <w:pStyle w:val="Prrafodelista"/>
+        <w:pStyle w:val="ListParagraph"/>
         <w:numPr>
           <w:ilvl w:val="1"/>
           <w:numId w:val="32"/>
@@ -16565,7 +16518,7 @@
     </w:p>
     <w:p>
       <w:pPr>
-        <w:pStyle w:val="Prrafodelista"/>
+        <w:pStyle w:val="ListParagraph"/>
         <w:numPr>
           <w:ilvl w:val="0"/>
           <w:numId w:val="32"/>
@@ -16609,11 +16562,30 @@
 </w:document>
 </file>
 
+<file path=word/endnotes.xml><?xml version="1.0" encoding="utf-8"?>
+<w:endnotes xmlns:wpc="http://schemas.microsoft.com/office/word/2010/wordprocessingCanvas" xmlns:cx="http://schemas.microsoft.com/office/drawing/2014/chartex" xmlns:cx1="http://schemas.microsoft.com/office/drawing/2015/9/8/chartex" xmlns:cx2="http://schemas.microsoft.com/office/drawing/2015/10/21/chartex" xmlns:cx3="http://schemas.microsoft.com/office/drawing/2016/5/9/chartex" xmlns:cx4="http://schemas.microsoft.com/office/drawing/2016/5/10/chartex" xmlns:cx5="http://schemas.microsoft.com/office/drawing/2016/5/11/chartex" xmlns:cx6="http://schemas.microsoft.com/office/drawing/2016/5/12/chartex" xmlns:cx7="http://schemas.microsoft.com/office/drawing/2016/5/13/chartex" xmlns:cx8="http://schemas.microsoft.com/office/drawing/2016/5/14/chartex" xmlns:mc="http://schemas.openxmlformats.org/markup-compatibility/2006" xmlns:aink="http://schemas.microsoft.com/office/drawing/2016/ink" xmlns:am3d="http://schemas.microsoft.com/office/drawing/2017/model3d" xmlns:o="urn:schemas-microsoft-com:office:office" xmlns:oel="http://schemas.microsoft.com/office/2019/extlst" xmlns:r="http://schemas.openxmlformats.org/officeDocument/2006/relationships" xmlns:m="http://schemas.openxmlformats.org/officeDocument/2006/math" xmlns:v="urn:schemas-microsoft-com:vml" xmlns:wp14="http://schemas.microsoft.com/office/word/2010/wordprocessingDrawing" xmlns:wp="http://schemas.openxmlformats.org/drawingml/2006/wordprocessingDrawing" xmlns:w10="urn:schemas-microsoft-com:office:word" xmlns:w="http://schemas.openxmlformats.org/wordprocessingml/2006/main" xmlns:w14="http://schemas.microsoft.com/office/word/2010/wordml" xmlns:w15="http://schemas.microsoft.com/office/word/2012/wordml" xmlns:w16cex="http://schemas.microsoft.com/office/word/2018/wordml/cex" xmlns:w16cid="http://schemas.microsoft.com/office/word/2016/wordml/cid" xmlns:w16="http://schemas.microsoft.com/office/word/2018/wordml" xmlns:w16du="http://schemas.microsoft.com/office/word/2023/wordml/word16du" xmlns:w16sdtdh="http://schemas.microsoft.com/office/word/2020/wordml/sdtdatahash" xmlns:w16sdtfl="http://schemas.microsoft.com/office/word/2024/wordml/sdtformatlock" xmlns:w16se="http://schemas.microsoft.com/office/word/2015/wordml/symex" xmlns:wpg="http://schemas.microsoft.com/office/word/2010/wordprocessingGroup" xmlns:wpi="http://schemas.microsoft.com/office/word/2010/wordprocessingInk" xmlns:wne="http://schemas.microsoft.com/office/word/2006/wordml" xmlns:wps="http://schemas.microsoft.com/office/word/2010/wordprocessingShape" mc:Ignorable="w14 w15 w16se w16cid w16 w16cex w16sdtdh w16sdtfl w16du wp14">
+  <w:endnote w:type="separator" w:id="-1">
+    <w:p>
+      <w:r>
+        <w:separator/>
+      </w:r>
+    </w:p>
+  </w:endnote>
+  <w:endnote w:type="continuationSeparator" w:id="0">
+    <w:p>
+      <w:r>
+        <w:continuationSeparator/>
+      </w:r>
+    </w:p>
+  </w:endnote>
+</w:endnotes>
+</file>
+
 <file path=word/footer1.xml><?xml version="1.0" encoding="utf-8"?>
 <w:ftr xmlns:wpc="http://schemas.microsoft.com/office/word/2010/wordprocessingCanvas" xmlns:cx="http://schemas.microsoft.com/office/drawing/2014/chartex" xmlns:cx1="http://schemas.microsoft.com/office/drawing/2015/9/8/chartex" xmlns:cx2="http://schemas.microsoft.com/office/drawing/2015/10/21/chartex" xmlns:cx3="http://schemas.microsoft.com/office/drawing/2016/5/9/chartex" xmlns:cx4="http://schemas.microsoft.com/office/drawing/2016/5/10/chartex" xmlns:cx5="http://schemas.microsoft.com/office/drawing/2016/5/11/chartex" xmlns:cx6="http://schemas.microsoft.com/office/drawing/2016/5/12/chartex" xmlns:cx7="http://schemas.microsoft.com/office/drawing/2016/5/13/chartex" xmlns:cx8="http://schemas.microsoft.com/office/drawing/2016/5/14/chartex" xmlns:mc="http://schemas.openxmlformats.org/markup-compatibility/2006" xmlns:aink="http://schemas.microsoft.com/office/drawing/2016/ink" xmlns:am3d="http://schemas.microsoft.com/office/drawing/2017/model3d" xmlns:o="urn:schemas-microsoft-com:office:office" xmlns:oel="http://schemas.microsoft.com/office/2019/extlst" xmlns:r="http://schemas.openxmlformats.org/officeDocument/2006/relationships" xmlns:m="http://schemas.openxmlformats.org/officeDocument/2006/math" xmlns:v="urn:schemas-microsoft-com:vml" xmlns:wp14="http://schemas.microsoft.com/office/word/2010/wordprocessingDrawing" xmlns:wp="http://schemas.openxmlformats.org/drawingml/2006/wordprocessingDrawing" xmlns:w10="urn:schemas-microsoft-com:office:word" xmlns:w="http://schemas.openxmlformats.org/wordprocessingml/2006/main" xmlns:w14="http://schemas.microsoft.com/office/word/2010/wordml" xmlns:w15="http://schemas.microsoft.com/office/word/2012/wordml" xmlns:w16cex="http://schemas.microsoft.com/office/word/2018/wordml/cex" xmlns:w16cid="http://schemas.microsoft.com/office/word/2016/wordml/cid" xmlns:w16="http://schemas.microsoft.com/office/word/2018/wordml" xmlns:w16du="http://schemas.microsoft.com/office/word/2023/wordml/word16du" xmlns:w16sdtdh="http://schemas.microsoft.com/office/word/2020/wordml/sdtdatahash" xmlns:w16sdtfl="http://schemas.microsoft.com/office/word/2024/wordml/sdtformatlock" xmlns:w16se="http://schemas.microsoft.com/office/word/2015/wordml/symex" xmlns:wpg="http://schemas.microsoft.com/office/word/2010/wordprocessingGroup" xmlns:wpi="http://schemas.microsoft.com/office/word/2010/wordprocessingInk" xmlns:wne="http://schemas.microsoft.com/office/word/2006/wordml" xmlns:wps="http://schemas.microsoft.com/office/word/2010/wordprocessingShape" mc:Ignorable="w14 w15 w16se w16cid w16 w16cex w16sdtdh w16sdtfl w16du wp14">
   <w:p>
     <w:pPr>
-      <w:pStyle w:val="Piedepgina"/>
+      <w:pStyle w:val="Footer"/>
       <w:pBdr>
         <w:top w:val="single" w:sz="4" w:space="1" w:color="auto"/>
       </w:pBdr>
@@ -16673,67 +16645,67 @@
     </w:r>
     <w:r>
       <w:rPr>
-        <w:rStyle w:val="Nmerodepgina"/>
+        <w:rStyle w:val="PageNumber"/>
       </w:rPr>
       <w:fldChar w:fldCharType="begin"/>
     </w:r>
     <w:r>
       <w:rPr>
-        <w:rStyle w:val="Nmerodepgina"/>
+        <w:rStyle w:val="PageNumber"/>
       </w:rPr>
       <w:instrText xml:space="preserve">PAGE  </w:instrText>
     </w:r>
     <w:r>
       <w:rPr>
-        <w:rStyle w:val="Nmerodepgina"/>
+        <w:rStyle w:val="PageNumber"/>
       </w:rPr>
       <w:fldChar w:fldCharType="separate"/>
     </w:r>
     <w:r>
       <w:rPr>
-        <w:rStyle w:val="Nmerodepgina"/>
+        <w:rStyle w:val="PageNumber"/>
       </w:rPr>
       <w:t>3</w:t>
     </w:r>
     <w:r>
       <w:rPr>
-        <w:rStyle w:val="Nmerodepgina"/>
+        <w:rStyle w:val="PageNumber"/>
       </w:rPr>
       <w:fldChar w:fldCharType="end"/>
     </w:r>
     <w:r>
       <w:rPr>
-        <w:rStyle w:val="Nmerodepgina"/>
+        <w:rStyle w:val="PageNumber"/>
       </w:rPr>
       <w:t>/</w:t>
     </w:r>
     <w:r>
       <w:rPr>
-        <w:rStyle w:val="Nmerodepgina"/>
+        <w:rStyle w:val="PageNumber"/>
       </w:rPr>
       <w:fldChar w:fldCharType="begin"/>
     </w:r>
     <w:r>
       <w:rPr>
-        <w:rStyle w:val="Nmerodepgina"/>
+        <w:rStyle w:val="PageNumber"/>
       </w:rPr>
       <w:instrText xml:space="preserve"> NUMPAGES </w:instrText>
     </w:r>
     <w:r>
       <w:rPr>
-        <w:rStyle w:val="Nmerodepgina"/>
+        <w:rStyle w:val="PageNumber"/>
       </w:rPr>
       <w:fldChar w:fldCharType="separate"/>
     </w:r>
     <w:r>
       <w:rPr>
-        <w:rStyle w:val="Nmerodepgina"/>
+        <w:rStyle w:val="PageNumber"/>
       </w:rPr>
       <w:t>15</w:t>
     </w:r>
     <w:r>
       <w:rPr>
-        <w:rStyle w:val="Nmerodepgina"/>
+        <w:rStyle w:val="PageNumber"/>
       </w:rPr>
       <w:fldChar w:fldCharType="end"/>
     </w:r>
@@ -16745,7 +16717,7 @@
 <w:ftr xmlns:wpc="http://schemas.microsoft.com/office/word/2010/wordprocessingCanvas" xmlns:cx="http://schemas.microsoft.com/office/drawing/2014/chartex" xmlns:cx1="http://schemas.microsoft.com/office/drawing/2015/9/8/chartex" xmlns:cx2="http://schemas.microsoft.com/office/drawing/2015/10/21/chartex" xmlns:cx3="http://schemas.microsoft.com/office/drawing/2016/5/9/chartex" xmlns:cx4="http://schemas.microsoft.com/office/drawing/2016/5/10/chartex" xmlns:cx5="http://schemas.microsoft.com/office/drawing/2016/5/11/chartex" xmlns:cx6="http://schemas.microsoft.com/office/drawing/2016/5/12/chartex" xmlns:cx7="http://schemas.microsoft.com/office/drawing/2016/5/13/chartex" xmlns:cx8="http://schemas.microsoft.com/office/drawing/2016/5/14/chartex" xmlns:mc="http://schemas.openxmlformats.org/markup-compatibility/2006" xmlns:aink="http://schemas.microsoft.com/office/drawing/2016/ink" xmlns:am3d="http://schemas.microsoft.com/office/drawing/2017/model3d" xmlns:o="urn:schemas-microsoft-com:office:office" xmlns:oel="http://schemas.microsoft.com/office/2019/extlst" xmlns:r="http://schemas.openxmlformats.org/officeDocument/2006/relationships" xmlns:m="http://schemas.openxmlformats.org/officeDocument/2006/math" xmlns:v="urn:schemas-microsoft-com:vml" xmlns:wp14="http://schemas.microsoft.com/office/word/2010/wordprocessingDrawing" xmlns:wp="http://schemas.openxmlformats.org/drawingml/2006/wordprocessingDrawing" xmlns:w10="urn:schemas-microsoft-com:office:word" xmlns:w="http://schemas.openxmlformats.org/wordprocessingml/2006/main" xmlns:w14="http://schemas.microsoft.com/office/word/2010/wordml" xmlns:w15="http://schemas.microsoft.com/office/word/2012/wordml" xmlns:w16cex="http://schemas.microsoft.com/office/word/2018/wordml/cex" xmlns:w16cid="http://schemas.microsoft.com/office/word/2016/wordml/cid" xmlns:w16="http://schemas.microsoft.com/office/word/2018/wordml" xmlns:w16du="http://schemas.microsoft.com/office/word/2023/wordml/word16du" xmlns:w16sdtdh="http://schemas.microsoft.com/office/word/2020/wordml/sdtdatahash" xmlns:w16sdtfl="http://schemas.microsoft.com/office/word/2024/wordml/sdtformatlock" xmlns:w16se="http://schemas.microsoft.com/office/word/2015/wordml/symex" xmlns:wpg="http://schemas.microsoft.com/office/word/2010/wordprocessingGroup" xmlns:wpi="http://schemas.microsoft.com/office/word/2010/wordprocessingInk" xmlns:wne="http://schemas.microsoft.com/office/word/2006/wordml" xmlns:wps="http://schemas.microsoft.com/office/word/2010/wordprocessingShape" mc:Ignorable="w14 w15 w16se w16cid w16 w16cex w16sdtdh w16sdtfl w16du wp14">
   <w:p>
     <w:pPr>
-      <w:pStyle w:val="Piedepgina"/>
+      <w:pStyle w:val="Footer"/>
       <w:jc w:val="right"/>
       <w:rPr>
         <w:sz w:val="18"/>
@@ -16754,67 +16726,67 @@
     </w:pPr>
     <w:r>
       <w:rPr>
-        <w:rStyle w:val="Nmerodepgina"/>
+        <w:rStyle w:val="PageNumber"/>
       </w:rPr>
       <w:fldChar w:fldCharType="begin"/>
     </w:r>
     <w:r>
       <w:rPr>
-        <w:rStyle w:val="Nmerodepgina"/>
+        <w:rStyle w:val="PageNumber"/>
       </w:rPr>
       <w:instrText xml:space="preserve">PAGE  </w:instrText>
     </w:r>
     <w:r>
       <w:rPr>
-        <w:rStyle w:val="Nmerodepgina"/>
+        <w:rStyle w:val="PageNumber"/>
       </w:rPr>
       <w:fldChar w:fldCharType="separate"/>
     </w:r>
     <w:r>
       <w:rPr>
-        <w:rStyle w:val="Nmerodepgina"/>
+        <w:rStyle w:val="PageNumber"/>
       </w:rPr>
       <w:t>1</w:t>
     </w:r>
     <w:r>
       <w:rPr>
-        <w:rStyle w:val="Nmerodepgina"/>
+        <w:rStyle w:val="PageNumber"/>
       </w:rPr>
       <w:fldChar w:fldCharType="end"/>
     </w:r>
     <w:r>
       <w:rPr>
-        <w:rStyle w:val="Nmerodepgina"/>
+        <w:rStyle w:val="PageNumber"/>
       </w:rPr>
       <w:t>/</w:t>
     </w:r>
     <w:r>
       <w:rPr>
-        <w:rStyle w:val="Nmerodepgina"/>
+        <w:rStyle w:val="PageNumber"/>
       </w:rPr>
       <w:fldChar w:fldCharType="begin"/>
     </w:r>
     <w:r>
       <w:rPr>
-        <w:rStyle w:val="Nmerodepgina"/>
+        <w:rStyle w:val="PageNumber"/>
       </w:rPr>
       <w:instrText xml:space="preserve"> NUMPAGES </w:instrText>
     </w:r>
     <w:r>
       <w:rPr>
-        <w:rStyle w:val="Nmerodepgina"/>
+        <w:rStyle w:val="PageNumber"/>
       </w:rPr>
       <w:fldChar w:fldCharType="separate"/>
     </w:r>
     <w:r>
       <w:rPr>
-        <w:rStyle w:val="Nmerodepgina"/>
+        <w:rStyle w:val="PageNumber"/>
       </w:rPr>
       <w:t>15</w:t>
     </w:r>
     <w:r>
       <w:rPr>
-        <w:rStyle w:val="Nmerodepgina"/>
+        <w:rStyle w:val="PageNumber"/>
       </w:rPr>
       <w:fldChar w:fldCharType="end"/>
     </w:r>
@@ -16826,7 +16798,7 @@
 <w:ftr xmlns:wpc="http://schemas.microsoft.com/office/word/2010/wordprocessingCanvas" xmlns:cx="http://schemas.microsoft.com/office/drawing/2014/chartex" xmlns:cx1="http://schemas.microsoft.com/office/drawing/2015/9/8/chartex" xmlns:cx2="http://schemas.microsoft.com/office/drawing/2015/10/21/chartex" xmlns:cx3="http://schemas.microsoft.com/office/drawing/2016/5/9/chartex" xmlns:cx4="http://schemas.microsoft.com/office/drawing/2016/5/10/chartex" xmlns:cx5="http://schemas.microsoft.com/office/drawing/2016/5/11/chartex" xmlns:cx6="http://schemas.microsoft.com/office/drawing/2016/5/12/chartex" xmlns:cx7="http://schemas.microsoft.com/office/drawing/2016/5/13/chartex" xmlns:cx8="http://schemas.microsoft.com/office/drawing/2016/5/14/chartex" xmlns:mc="http://schemas.openxmlformats.org/markup-compatibility/2006" xmlns:aink="http://schemas.microsoft.com/office/drawing/2016/ink" xmlns:am3d="http://schemas.microsoft.com/office/drawing/2017/model3d" xmlns:o="urn:schemas-microsoft-com:office:office" xmlns:oel="http://schemas.microsoft.com/office/2019/extlst" xmlns:r="http://schemas.openxmlformats.org/officeDocument/2006/relationships" xmlns:m="http://schemas.openxmlformats.org/officeDocument/2006/math" xmlns:v="urn:schemas-microsoft-com:vml" xmlns:wp14="http://schemas.microsoft.com/office/word/2010/wordprocessingDrawing" xmlns:wp="http://schemas.openxmlformats.org/drawingml/2006/wordprocessingDrawing" xmlns:w10="urn:schemas-microsoft-com:office:word" xmlns:w="http://schemas.openxmlformats.org/wordprocessingml/2006/main" xmlns:w14="http://schemas.microsoft.com/office/word/2010/wordml" xmlns:w15="http://schemas.microsoft.com/office/word/2012/wordml" xmlns:w16cex="http://schemas.microsoft.com/office/word/2018/wordml/cex" xmlns:w16cid="http://schemas.microsoft.com/office/word/2016/wordml/cid" xmlns:w16="http://schemas.microsoft.com/office/word/2018/wordml" xmlns:w16du="http://schemas.microsoft.com/office/word/2023/wordml/word16du" xmlns:w16sdtdh="http://schemas.microsoft.com/office/word/2020/wordml/sdtdatahash" xmlns:w16sdtfl="http://schemas.microsoft.com/office/word/2024/wordml/sdtformatlock" xmlns:w16se="http://schemas.microsoft.com/office/word/2015/wordml/symex" xmlns:wpg="http://schemas.microsoft.com/office/word/2010/wordprocessingGroup" xmlns:wpi="http://schemas.microsoft.com/office/word/2010/wordprocessingInk" xmlns:wne="http://schemas.microsoft.com/office/word/2006/wordml" xmlns:wps="http://schemas.microsoft.com/office/word/2010/wordprocessingShape" mc:Ignorable="w14 w15 w16se w16cid w16 w16cex w16sdtdh w16sdtfl w16du wp14">
   <w:p>
     <w:pPr>
-      <w:pStyle w:val="Piedepgina"/>
+      <w:pStyle w:val="Footer"/>
       <w:pBdr>
         <w:top w:val="single" w:sz="4" w:space="1" w:color="auto"/>
       </w:pBdr>
@@ -16838,72 +16810,91 @@
     </w:pPr>
     <w:r>
       <w:rPr>
-        <w:rStyle w:val="Nmerodepgina"/>
+        <w:rStyle w:val="PageNumber"/>
       </w:rPr>
       <w:fldChar w:fldCharType="begin"/>
     </w:r>
     <w:r>
       <w:rPr>
-        <w:rStyle w:val="Nmerodepgina"/>
+        <w:rStyle w:val="PageNumber"/>
       </w:rPr>
       <w:instrText xml:space="preserve">PAGE  </w:instrText>
     </w:r>
     <w:r>
       <w:rPr>
-        <w:rStyle w:val="Nmerodepgina"/>
+        <w:rStyle w:val="PageNumber"/>
       </w:rPr>
       <w:fldChar w:fldCharType="separate"/>
     </w:r>
     <w:r>
       <w:rPr>
-        <w:rStyle w:val="Nmerodepgina"/>
+        <w:rStyle w:val="PageNumber"/>
       </w:rPr>
       <w:t>1</w:t>
     </w:r>
     <w:r>
       <w:rPr>
-        <w:rStyle w:val="Nmerodepgina"/>
+        <w:rStyle w:val="PageNumber"/>
       </w:rPr>
       <w:fldChar w:fldCharType="end"/>
     </w:r>
     <w:r>
       <w:rPr>
-        <w:rStyle w:val="Nmerodepgina"/>
+        <w:rStyle w:val="PageNumber"/>
       </w:rPr>
       <w:t>/</w:t>
     </w:r>
     <w:r>
       <w:rPr>
-        <w:rStyle w:val="Nmerodepgina"/>
+        <w:rStyle w:val="PageNumber"/>
       </w:rPr>
       <w:fldChar w:fldCharType="begin"/>
     </w:r>
     <w:r>
       <w:rPr>
-        <w:rStyle w:val="Nmerodepgina"/>
+        <w:rStyle w:val="PageNumber"/>
       </w:rPr>
       <w:instrText xml:space="preserve"> NUMPAGES </w:instrText>
     </w:r>
     <w:r>
       <w:rPr>
-        <w:rStyle w:val="Nmerodepgina"/>
+        <w:rStyle w:val="PageNumber"/>
       </w:rPr>
       <w:fldChar w:fldCharType="separate"/>
     </w:r>
     <w:r>
       <w:rPr>
-        <w:rStyle w:val="Nmerodepgina"/>
+        <w:rStyle w:val="PageNumber"/>
       </w:rPr>
       <w:t>15</w:t>
     </w:r>
     <w:r>
       <w:rPr>
-        <w:rStyle w:val="Nmerodepgina"/>
+        <w:rStyle w:val="PageNumber"/>
       </w:rPr>
       <w:fldChar w:fldCharType="end"/>
     </w:r>
   </w:p>
 </w:ftr>
+</file>
+
+<file path=word/footnotes.xml><?xml version="1.0" encoding="utf-8"?>
+<w:footnotes xmlns:wpc="http://schemas.microsoft.com/office/word/2010/wordprocessingCanvas" xmlns:cx="http://schemas.microsoft.com/office/drawing/2014/chartex" xmlns:cx1="http://schemas.microsoft.com/office/drawing/2015/9/8/chartex" xmlns:cx2="http://schemas.microsoft.com/office/drawing/2015/10/21/chartex" xmlns:cx3="http://schemas.microsoft.com/office/drawing/2016/5/9/chartex" xmlns:cx4="http://schemas.microsoft.com/office/drawing/2016/5/10/chartex" xmlns:cx5="http://schemas.microsoft.com/office/drawing/2016/5/11/chartex" xmlns:cx6="http://schemas.microsoft.com/office/drawing/2016/5/12/chartex" xmlns:cx7="http://schemas.microsoft.com/office/drawing/2016/5/13/chartex" xmlns:cx8="http://schemas.microsoft.com/office/drawing/2016/5/14/chartex" xmlns:mc="http://schemas.openxmlformats.org/markup-compatibility/2006" xmlns:aink="http://schemas.microsoft.com/office/drawing/2016/ink" xmlns:am3d="http://schemas.microsoft.com/office/drawing/2017/model3d" xmlns:o="urn:schemas-microsoft-com:office:office" xmlns:oel="http://schemas.microsoft.com/office/2019/extlst" xmlns:r="http://schemas.openxmlformats.org/officeDocument/2006/relationships" xmlns:m="http://schemas.openxmlformats.org/officeDocument/2006/math" xmlns:v="urn:schemas-microsoft-com:vml" xmlns:wp14="http://schemas.microsoft.com/office/word/2010/wordprocessingDrawing" xmlns:wp="http://schemas.openxmlformats.org/drawingml/2006/wordprocessingDrawing" xmlns:w10="urn:schemas-microsoft-com:office:word" xmlns:w="http://schemas.openxmlformats.org/wordprocessingml/2006/main" xmlns:w14="http://schemas.microsoft.com/office/word/2010/wordml" xmlns:w15="http://schemas.microsoft.com/office/word/2012/wordml" xmlns:w16cex="http://schemas.microsoft.com/office/word/2018/wordml/cex" xmlns:w16cid="http://schemas.microsoft.com/office/word/2016/wordml/cid" xmlns:w16="http://schemas.microsoft.com/office/word/2018/wordml" xmlns:w16du="http://schemas.microsoft.com/office/word/2023/wordml/word16du" xmlns:w16sdtdh="http://schemas.microsoft.com/office/word/2020/wordml/sdtdatahash" xmlns:w16sdtfl="http://schemas.microsoft.com/office/word/2024/wordml/sdtformatlock" xmlns:w16se="http://schemas.microsoft.com/office/word/2015/wordml/symex" xmlns:wpg="http://schemas.microsoft.com/office/word/2010/wordprocessingGroup" xmlns:wpi="http://schemas.microsoft.com/office/word/2010/wordprocessingInk" xmlns:wne="http://schemas.microsoft.com/office/word/2006/wordml" xmlns:wps="http://schemas.microsoft.com/office/word/2010/wordprocessingShape" mc:Ignorable="w14 w15 w16se w16cid w16 w16cex w16sdtdh w16sdtfl w16du wp14">
+  <w:footnote w:type="separator" w:id="-1">
+    <w:p>
+      <w:r>
+        <w:separator/>
+      </w:r>
+    </w:p>
+  </w:footnote>
+  <w:footnote w:type="continuationSeparator" w:id="0">
+    <w:p>
+      <w:r>
+        <w:continuationSeparator/>
+      </w:r>
+    </w:p>
+  </w:footnote>
+</w:footnotes>
 </file>
 
 <file path=word/numbering.xml><?xml version="1.0" encoding="utf-8"?>
@@ -21865,11 +21856,11 @@
       <w14:ligatures w14:val="none"/>
     </w:rPr>
   </w:style>
-  <w:style w:type="paragraph" w:styleId="Ttulo1">
+  <w:style w:type="paragraph" w:styleId="Heading1">
     <w:name w:val="heading 1"/>
     <w:basedOn w:val="Normal"/>
     <w:next w:val="Normal"/>
-    <w:link w:val="Ttulo1Car"/>
+    <w:link w:val="Heading1Char"/>
     <w:qFormat/>
     <w:rsid w:val="009648B9"/>
     <w:pPr>
@@ -21885,11 +21876,11 @@
       <w:szCs w:val="40"/>
     </w:rPr>
   </w:style>
-  <w:style w:type="paragraph" w:styleId="Ttulo2">
+  <w:style w:type="paragraph" w:styleId="Heading2">
     <w:name w:val="heading 2"/>
     <w:basedOn w:val="Normal"/>
     <w:next w:val="Normal"/>
-    <w:link w:val="Ttulo2Car"/>
+    <w:link w:val="Heading2Char"/>
     <w:uiPriority w:val="9"/>
     <w:semiHidden/>
     <w:unhideWhenUsed/>
@@ -21908,11 +21899,11 @@
       <w:szCs w:val="32"/>
     </w:rPr>
   </w:style>
-  <w:style w:type="paragraph" w:styleId="Ttulo3">
+  <w:style w:type="paragraph" w:styleId="Heading3">
     <w:name w:val="heading 3"/>
     <w:basedOn w:val="Normal"/>
     <w:next w:val="Normal"/>
-    <w:link w:val="Ttulo3Car"/>
+    <w:link w:val="Heading3Char"/>
     <w:uiPriority w:val="9"/>
     <w:semiHidden/>
     <w:unhideWhenUsed/>
@@ -21931,11 +21922,11 @@
       <w:szCs w:val="28"/>
     </w:rPr>
   </w:style>
-  <w:style w:type="paragraph" w:styleId="Ttulo4">
+  <w:style w:type="paragraph" w:styleId="Heading4">
     <w:name w:val="heading 4"/>
     <w:basedOn w:val="Normal"/>
     <w:next w:val="Normal"/>
-    <w:link w:val="Ttulo4Car"/>
+    <w:link w:val="Heading4Char"/>
     <w:uiPriority w:val="9"/>
     <w:semiHidden/>
     <w:unhideWhenUsed/>
@@ -21954,11 +21945,11 @@
       <w:color w:val="0F4761" w:themeColor="accent1" w:themeShade="BF"/>
     </w:rPr>
   </w:style>
-  <w:style w:type="paragraph" w:styleId="Ttulo5">
+  <w:style w:type="paragraph" w:styleId="Heading5">
     <w:name w:val="heading 5"/>
     <w:basedOn w:val="Normal"/>
     <w:next w:val="Normal"/>
-    <w:link w:val="Ttulo5Car"/>
+    <w:link w:val="Heading5Char"/>
     <w:uiPriority w:val="9"/>
     <w:semiHidden/>
     <w:unhideWhenUsed/>
@@ -21975,11 +21966,11 @@
       <w:color w:val="0F4761" w:themeColor="accent1" w:themeShade="BF"/>
     </w:rPr>
   </w:style>
-  <w:style w:type="paragraph" w:styleId="Ttulo6">
+  <w:style w:type="paragraph" w:styleId="Heading6">
     <w:name w:val="heading 6"/>
     <w:basedOn w:val="Normal"/>
     <w:next w:val="Normal"/>
-    <w:link w:val="Ttulo6Car"/>
+    <w:link w:val="Heading6Char"/>
     <w:uiPriority w:val="9"/>
     <w:semiHidden/>
     <w:unhideWhenUsed/>
@@ -21998,11 +21989,11 @@
       <w:color w:val="595959" w:themeColor="text1" w:themeTint="A6"/>
     </w:rPr>
   </w:style>
-  <w:style w:type="paragraph" w:styleId="Ttulo7">
+  <w:style w:type="paragraph" w:styleId="Heading7">
     <w:name w:val="heading 7"/>
     <w:basedOn w:val="Normal"/>
     <w:next w:val="Normal"/>
-    <w:link w:val="Ttulo7Car"/>
+    <w:link w:val="Heading7Char"/>
     <w:uiPriority w:val="9"/>
     <w:semiHidden/>
     <w:unhideWhenUsed/>
@@ -22019,11 +22010,11 @@
       <w:color w:val="595959" w:themeColor="text1" w:themeTint="A6"/>
     </w:rPr>
   </w:style>
-  <w:style w:type="paragraph" w:styleId="Ttulo8">
+  <w:style w:type="paragraph" w:styleId="Heading8">
     <w:name w:val="heading 8"/>
     <w:basedOn w:val="Normal"/>
     <w:next w:val="Normal"/>
-    <w:link w:val="Ttulo8Car"/>
+    <w:link w:val="Heading8Char"/>
     <w:semiHidden/>
     <w:unhideWhenUsed/>
     <w:qFormat/>
@@ -22040,11 +22031,11 @@
       <w:color w:val="272727" w:themeColor="text1" w:themeTint="D8"/>
     </w:rPr>
   </w:style>
-  <w:style w:type="paragraph" w:styleId="Ttulo9">
+  <w:style w:type="paragraph" w:styleId="Heading9">
     <w:name w:val="heading 9"/>
     <w:basedOn w:val="Normal"/>
     <w:next w:val="Normal"/>
-    <w:link w:val="Ttulo9Car"/>
+    <w:link w:val="Heading9Char"/>
     <w:uiPriority w:val="9"/>
     <w:semiHidden/>
     <w:unhideWhenUsed/>
@@ -22060,13 +22051,13 @@
       <w:color w:val="272727" w:themeColor="text1" w:themeTint="D8"/>
     </w:rPr>
   </w:style>
-  <w:style w:type="character" w:default="1" w:styleId="Fuentedeprrafopredeter">
+  <w:style w:type="character" w:default="1" w:styleId="DefaultParagraphFont">
     <w:name w:val="Default Paragraph Font"/>
     <w:uiPriority w:val="1"/>
     <w:semiHidden/>
     <w:unhideWhenUsed/>
   </w:style>
-  <w:style w:type="table" w:default="1" w:styleId="Tablanormal">
+  <w:style w:type="table" w:default="1" w:styleId="TableNormal">
     <w:name w:val="Normal Table"/>
     <w:uiPriority w:val="99"/>
     <w:semiHidden/>
@@ -22081,16 +22072,16 @@
       </w:tblCellMar>
     </w:tblPr>
   </w:style>
-  <w:style w:type="numbering" w:default="1" w:styleId="Sinlista">
+  <w:style w:type="numbering" w:default="1" w:styleId="NoList">
     <w:name w:val="No List"/>
     <w:uiPriority w:val="99"/>
     <w:semiHidden/>
     <w:unhideWhenUsed/>
   </w:style>
-  <w:style w:type="character" w:customStyle="1" w:styleId="Ttulo1Car">
-    <w:name w:val="Título 1 Car"/>
-    <w:basedOn w:val="Fuentedeprrafopredeter"/>
-    <w:link w:val="Ttulo1"/>
+  <w:style w:type="character" w:customStyle="1" w:styleId="Heading1Char">
+    <w:name w:val="Heading 1 Char"/>
+    <w:basedOn w:val="DefaultParagraphFont"/>
+    <w:link w:val="Heading1"/>
     <w:rsid w:val="009648B9"/>
     <w:rPr>
       <w:rFonts w:asciiTheme="majorHAnsi" w:eastAsiaTheme="majorEastAsia" w:hAnsiTheme="majorHAnsi" w:cstheme="majorBidi"/>
@@ -22100,10 +22091,10 @@
       <w:lang w:val="es-MX"/>
     </w:rPr>
   </w:style>
-  <w:style w:type="character" w:customStyle="1" w:styleId="Ttulo2Car">
-    <w:name w:val="Título 2 Car"/>
-    <w:basedOn w:val="Fuentedeprrafopredeter"/>
-    <w:link w:val="Ttulo2"/>
+  <w:style w:type="character" w:customStyle="1" w:styleId="Heading2Char">
+    <w:name w:val="Heading 2 Char"/>
+    <w:basedOn w:val="DefaultParagraphFont"/>
+    <w:link w:val="Heading2"/>
     <w:uiPriority w:val="9"/>
     <w:semiHidden/>
     <w:rsid w:val="009648B9"/>
@@ -22115,10 +22106,10 @@
       <w:lang w:val="es-MX"/>
     </w:rPr>
   </w:style>
-  <w:style w:type="character" w:customStyle="1" w:styleId="Ttulo3Car">
-    <w:name w:val="Título 3 Car"/>
-    <w:basedOn w:val="Fuentedeprrafopredeter"/>
-    <w:link w:val="Ttulo3"/>
+  <w:style w:type="character" w:customStyle="1" w:styleId="Heading3Char">
+    <w:name w:val="Heading 3 Char"/>
+    <w:basedOn w:val="DefaultParagraphFont"/>
+    <w:link w:val="Heading3"/>
     <w:uiPriority w:val="9"/>
     <w:semiHidden/>
     <w:rsid w:val="009648B9"/>
@@ -22130,10 +22121,10 @@
       <w:lang w:val="es-MX"/>
     </w:rPr>
   </w:style>
-  <w:style w:type="character" w:customStyle="1" w:styleId="Ttulo4Car">
-    <w:name w:val="Título 4 Car"/>
-    <w:basedOn w:val="Fuentedeprrafopredeter"/>
-    <w:link w:val="Ttulo4"/>
+  <w:style w:type="character" w:customStyle="1" w:styleId="Heading4Char">
+    <w:name w:val="Heading 4 Char"/>
+    <w:basedOn w:val="DefaultParagraphFont"/>
+    <w:link w:val="Heading4"/>
     <w:uiPriority w:val="9"/>
     <w:semiHidden/>
     <w:rsid w:val="009648B9"/>
@@ -22145,10 +22136,10 @@
       <w:lang w:val="es-MX"/>
     </w:rPr>
   </w:style>
-  <w:style w:type="character" w:customStyle="1" w:styleId="Ttulo5Car">
-    <w:name w:val="Título 5 Car"/>
-    <w:basedOn w:val="Fuentedeprrafopredeter"/>
-    <w:link w:val="Ttulo5"/>
+  <w:style w:type="character" w:customStyle="1" w:styleId="Heading5Char">
+    <w:name w:val="Heading 5 Char"/>
+    <w:basedOn w:val="DefaultParagraphFont"/>
+    <w:link w:val="Heading5"/>
     <w:uiPriority w:val="9"/>
     <w:semiHidden/>
     <w:rsid w:val="009648B9"/>
@@ -22158,10 +22149,10 @@
       <w:lang w:val="es-MX"/>
     </w:rPr>
   </w:style>
-  <w:style w:type="character" w:customStyle="1" w:styleId="Ttulo6Car">
-    <w:name w:val="Título 6 Car"/>
-    <w:basedOn w:val="Fuentedeprrafopredeter"/>
-    <w:link w:val="Ttulo6"/>
+  <w:style w:type="character" w:customStyle="1" w:styleId="Heading6Char">
+    <w:name w:val="Heading 6 Char"/>
+    <w:basedOn w:val="DefaultParagraphFont"/>
+    <w:link w:val="Heading6"/>
     <w:uiPriority w:val="9"/>
     <w:semiHidden/>
     <w:rsid w:val="009648B9"/>
@@ -22173,10 +22164,10 @@
       <w:lang w:val="es-MX"/>
     </w:rPr>
   </w:style>
-  <w:style w:type="character" w:customStyle="1" w:styleId="Ttulo7Car">
-    <w:name w:val="Título 7 Car"/>
-    <w:basedOn w:val="Fuentedeprrafopredeter"/>
-    <w:link w:val="Ttulo7"/>
+  <w:style w:type="character" w:customStyle="1" w:styleId="Heading7Char">
+    <w:name w:val="Heading 7 Char"/>
+    <w:basedOn w:val="DefaultParagraphFont"/>
+    <w:link w:val="Heading7"/>
     <w:uiPriority w:val="9"/>
     <w:semiHidden/>
     <w:rsid w:val="009648B9"/>
@@ -22186,10 +22177,10 @@
       <w:lang w:val="es-MX"/>
     </w:rPr>
   </w:style>
-  <w:style w:type="character" w:customStyle="1" w:styleId="Ttulo8Car">
-    <w:name w:val="Título 8 Car"/>
-    <w:basedOn w:val="Fuentedeprrafopredeter"/>
-    <w:link w:val="Ttulo8"/>
+  <w:style w:type="character" w:customStyle="1" w:styleId="Heading8Char">
+    <w:name w:val="Heading 8 Char"/>
+    <w:basedOn w:val="DefaultParagraphFont"/>
+    <w:link w:val="Heading8"/>
     <w:semiHidden/>
     <w:rsid w:val="009648B9"/>
     <w:rPr>
@@ -22200,10 +22191,10 @@
       <w:lang w:val="es-MX"/>
     </w:rPr>
   </w:style>
-  <w:style w:type="character" w:customStyle="1" w:styleId="Ttulo9Car">
-    <w:name w:val="Título 9 Car"/>
-    <w:basedOn w:val="Fuentedeprrafopredeter"/>
-    <w:link w:val="Ttulo9"/>
+  <w:style w:type="character" w:customStyle="1" w:styleId="Heading9Char">
+    <w:name w:val="Heading 9 Char"/>
+    <w:basedOn w:val="DefaultParagraphFont"/>
+    <w:link w:val="Heading9"/>
     <w:uiPriority w:val="9"/>
     <w:semiHidden/>
     <w:rsid w:val="009648B9"/>
@@ -22213,11 +22204,11 @@
       <w:lang w:val="es-MX"/>
     </w:rPr>
   </w:style>
-  <w:style w:type="paragraph" w:styleId="Ttulo">
+  <w:style w:type="paragraph" w:styleId="Title">
     <w:name w:val="Title"/>
     <w:basedOn w:val="Normal"/>
     <w:next w:val="Normal"/>
-    <w:link w:val="TtuloCar"/>
+    <w:link w:val="TitleChar"/>
     <w:uiPriority w:val="10"/>
     <w:qFormat/>
     <w:rsid w:val="009648B9"/>
@@ -22233,10 +22224,10 @@
       <w:szCs w:val="56"/>
     </w:rPr>
   </w:style>
-  <w:style w:type="character" w:customStyle="1" w:styleId="TtuloCar">
-    <w:name w:val="Título Car"/>
-    <w:basedOn w:val="Fuentedeprrafopredeter"/>
-    <w:link w:val="Ttulo"/>
+  <w:style w:type="character" w:customStyle="1" w:styleId="TitleChar">
+    <w:name w:val="Title Char"/>
+    <w:basedOn w:val="DefaultParagraphFont"/>
+    <w:link w:val="Title"/>
     <w:uiPriority w:val="10"/>
     <w:rsid w:val="009648B9"/>
     <w:rPr>
@@ -22248,11 +22239,11 @@
       <w:lang w:val="es-MX"/>
     </w:rPr>
   </w:style>
-  <w:style w:type="paragraph" w:styleId="Subttulo">
+  <w:style w:type="paragraph" w:styleId="Subtitle">
     <w:name w:val="Subtitle"/>
     <w:basedOn w:val="Normal"/>
     <w:next w:val="Normal"/>
-    <w:link w:val="SubttuloCar"/>
+    <w:link w:val="SubtitleChar"/>
     <w:uiPriority w:val="11"/>
     <w:qFormat/>
     <w:rsid w:val="009648B9"/>
@@ -22269,10 +22260,10 @@
       <w:szCs w:val="28"/>
     </w:rPr>
   </w:style>
-  <w:style w:type="character" w:customStyle="1" w:styleId="SubttuloCar">
-    <w:name w:val="Subtítulo Car"/>
-    <w:basedOn w:val="Fuentedeprrafopredeter"/>
-    <w:link w:val="Subttulo"/>
+  <w:style w:type="character" w:customStyle="1" w:styleId="SubtitleChar">
+    <w:name w:val="Subtitle Char"/>
+    <w:basedOn w:val="DefaultParagraphFont"/>
+    <w:link w:val="Subtitle"/>
     <w:uiPriority w:val="11"/>
     <w:rsid w:val="009648B9"/>
     <w:rPr>
@@ -22284,11 +22275,11 @@
       <w:lang w:val="es-MX"/>
     </w:rPr>
   </w:style>
-  <w:style w:type="paragraph" w:styleId="Cita">
+  <w:style w:type="paragraph" w:styleId="Quote">
     <w:name w:val="Quote"/>
     <w:basedOn w:val="Normal"/>
     <w:next w:val="Normal"/>
-    <w:link w:val="CitaCar"/>
+    <w:link w:val="QuoteChar"/>
     <w:uiPriority w:val="29"/>
     <w:qFormat/>
     <w:rsid w:val="009648B9"/>
@@ -22302,10 +22293,10 @@
       <w:color w:val="404040" w:themeColor="text1" w:themeTint="BF"/>
     </w:rPr>
   </w:style>
-  <w:style w:type="character" w:customStyle="1" w:styleId="CitaCar">
-    <w:name w:val="Cita Car"/>
-    <w:basedOn w:val="Fuentedeprrafopredeter"/>
-    <w:link w:val="Cita"/>
+  <w:style w:type="character" w:customStyle="1" w:styleId="QuoteChar">
+    <w:name w:val="Quote Char"/>
+    <w:basedOn w:val="DefaultParagraphFont"/>
+    <w:link w:val="Quote"/>
     <w:uiPriority w:val="29"/>
     <w:rsid w:val="009648B9"/>
     <w:rPr>
@@ -22315,7 +22306,7 @@
       <w:lang w:val="es-MX"/>
     </w:rPr>
   </w:style>
-  <w:style w:type="paragraph" w:styleId="Prrafodelista">
+  <w:style w:type="paragraph" w:styleId="ListParagraph">
     <w:name w:val="List Paragraph"/>
     <w:basedOn w:val="Normal"/>
     <w:uiPriority w:val="34"/>
@@ -22326,9 +22317,9 @@
       <w:contextualSpacing/>
     </w:pPr>
   </w:style>
-  <w:style w:type="character" w:styleId="nfasisintenso">
+  <w:style w:type="character" w:styleId="IntenseEmphasis">
     <w:name w:val="Intense Emphasis"/>
-    <w:basedOn w:val="Fuentedeprrafopredeter"/>
+    <w:basedOn w:val="DefaultParagraphFont"/>
     <w:uiPriority w:val="21"/>
     <w:qFormat/>
     <w:rsid w:val="009648B9"/>
@@ -22338,11 +22329,11 @@
       <w:color w:val="0F4761" w:themeColor="accent1" w:themeShade="BF"/>
     </w:rPr>
   </w:style>
-  <w:style w:type="paragraph" w:styleId="Citadestacada">
+  <w:style w:type="paragraph" w:styleId="IntenseQuote">
     <w:name w:val="Intense Quote"/>
     <w:basedOn w:val="Normal"/>
     <w:next w:val="Normal"/>
-    <w:link w:val="CitadestacadaCar"/>
+    <w:link w:val="IntenseQuoteChar"/>
     <w:uiPriority w:val="30"/>
     <w:qFormat/>
     <w:rsid w:val="009648B9"/>
@@ -22361,10 +22352,10 @@
       <w:color w:val="0F4761" w:themeColor="accent1" w:themeShade="BF"/>
     </w:rPr>
   </w:style>
-  <w:style w:type="character" w:customStyle="1" w:styleId="CitadestacadaCar">
-    <w:name w:val="Cita destacada Car"/>
-    <w:basedOn w:val="Fuentedeprrafopredeter"/>
-    <w:link w:val="Citadestacada"/>
+  <w:style w:type="character" w:customStyle="1" w:styleId="IntenseQuoteChar">
+    <w:name w:val="Intense Quote Char"/>
+    <w:basedOn w:val="DefaultParagraphFont"/>
+    <w:link w:val="IntenseQuote"/>
     <w:uiPriority w:val="30"/>
     <w:rsid w:val="009648B9"/>
     <w:rPr>
@@ -22374,9 +22365,9 @@
       <w:lang w:val="es-MX"/>
     </w:rPr>
   </w:style>
-  <w:style w:type="character" w:styleId="Referenciaintensa">
+  <w:style w:type="character" w:styleId="IntenseReference">
     <w:name w:val="Intense Reference"/>
-    <w:basedOn w:val="Fuentedeprrafopredeter"/>
+    <w:basedOn w:val="DefaultParagraphFont"/>
     <w:uiPriority w:val="32"/>
     <w:qFormat/>
     <w:rsid w:val="009648B9"/>
@@ -22575,9 +22566,9 @@
       <w:color w:val="008000"/>
     </w:rPr>
   </w:style>
-  <w:style w:type="table" w:styleId="Tablaconcuadrcula">
+  <w:style w:type="table" w:styleId="TableGrid">
     <w:name w:val="Table Grid"/>
-    <w:basedOn w:val="Tablanormal"/>
+    <w:basedOn w:val="TableNormal"/>
     <w:uiPriority w:val="59"/>
     <w:rsid w:val="0014625E"/>
     <w:pPr>
@@ -22601,10 +22592,10 @@
       </w:tblBorders>
     </w:tblPr>
   </w:style>
-  <w:style w:type="paragraph" w:styleId="Encabezado">
+  <w:style w:type="paragraph" w:styleId="Header">
     <w:name w:val="header"/>
     <w:basedOn w:val="Normal"/>
-    <w:link w:val="EncabezadoCar"/>
+    <w:link w:val="HeaderChar"/>
     <w:rsid w:val="0014625E"/>
     <w:pPr>
       <w:tabs>
@@ -22613,10 +22604,10 @@
       </w:tabs>
     </w:pPr>
   </w:style>
-  <w:style w:type="character" w:customStyle="1" w:styleId="EncabezadoCar">
-    <w:name w:val="Encabezado Car"/>
-    <w:basedOn w:val="Fuentedeprrafopredeter"/>
-    <w:link w:val="Encabezado"/>
+  <w:style w:type="character" w:customStyle="1" w:styleId="HeaderChar">
+    <w:name w:val="Header Char"/>
+    <w:basedOn w:val="DefaultParagraphFont"/>
+    <w:link w:val="Header"/>
     <w:rsid w:val="0014625E"/>
     <w:rPr>
       <w:rFonts w:ascii="Times New Roman" w:eastAsia="Times New Roman" w:hAnsi="Times New Roman" w:cs="Times New Roman"/>
@@ -22627,10 +22618,10 @@
       <w14:ligatures w14:val="none"/>
     </w:rPr>
   </w:style>
-  <w:style w:type="paragraph" w:styleId="Piedepgina">
+  <w:style w:type="paragraph" w:styleId="Footer">
     <w:name w:val="footer"/>
     <w:basedOn w:val="Normal"/>
-    <w:link w:val="PiedepginaCar"/>
+    <w:link w:val="FooterChar"/>
     <w:rsid w:val="0014625E"/>
     <w:pPr>
       <w:tabs>
@@ -22639,10 +22630,10 @@
       </w:tabs>
     </w:pPr>
   </w:style>
-  <w:style w:type="character" w:customStyle="1" w:styleId="PiedepginaCar">
-    <w:name w:val="Pie de página Car"/>
-    <w:basedOn w:val="Fuentedeprrafopredeter"/>
-    <w:link w:val="Piedepgina"/>
+  <w:style w:type="character" w:customStyle="1" w:styleId="FooterChar">
+    <w:name w:val="Footer Char"/>
+    <w:basedOn w:val="DefaultParagraphFont"/>
+    <w:link w:val="Footer"/>
     <w:rsid w:val="0014625E"/>
     <w:rPr>
       <w:rFonts w:ascii="Times New Roman" w:eastAsia="Times New Roman" w:hAnsi="Times New Roman" w:cs="Times New Roman"/>
@@ -22653,15 +22644,15 @@
       <w14:ligatures w14:val="none"/>
     </w:rPr>
   </w:style>
-  <w:style w:type="character" w:styleId="Nmerodepgina">
+  <w:style w:type="character" w:styleId="PageNumber">
     <w:name w:val="page number"/>
-    <w:basedOn w:val="Fuentedeprrafopredeter"/>
+    <w:basedOn w:val="DefaultParagraphFont"/>
     <w:rsid w:val="0014625E"/>
   </w:style>
-  <w:style w:type="paragraph" w:styleId="Textodeglobo">
+  <w:style w:type="paragraph" w:styleId="BalloonText">
     <w:name w:val="Balloon Text"/>
     <w:basedOn w:val="Normal"/>
-    <w:link w:val="TextodegloboCar"/>
+    <w:link w:val="BalloonTextChar"/>
     <w:semiHidden/>
     <w:rsid w:val="0014625E"/>
     <w:rPr>
@@ -22670,10 +22661,10 @@
       <w:szCs w:val="16"/>
     </w:rPr>
   </w:style>
-  <w:style w:type="character" w:customStyle="1" w:styleId="TextodegloboCar">
-    <w:name w:val="Texto de globo Car"/>
-    <w:basedOn w:val="Fuentedeprrafopredeter"/>
-    <w:link w:val="Textodeglobo"/>
+  <w:style w:type="character" w:customStyle="1" w:styleId="BalloonTextChar">
+    <w:name w:val="Balloon Text Char"/>
+    <w:basedOn w:val="DefaultParagraphFont"/>
+    <w:link w:val="BalloonText"/>
     <w:semiHidden/>
     <w:rsid w:val="0014625E"/>
     <w:rPr>
@@ -22685,10 +22676,10 @@
       <w14:ligatures w14:val="none"/>
     </w:rPr>
   </w:style>
-  <w:style w:type="paragraph" w:styleId="Sangra3detindependiente">
+  <w:style w:type="paragraph" w:styleId="BodyTextIndent3">
     <w:name w:val="Body Text Indent 3"/>
     <w:basedOn w:val="Normal"/>
-    <w:link w:val="Sangra3detindependienteCar"/>
+    <w:link w:val="BodyTextIndent3Char"/>
     <w:uiPriority w:val="99"/>
     <w:unhideWhenUsed/>
     <w:rsid w:val="0014625E"/>
@@ -22700,10 +22691,10 @@
       <w:lang w:eastAsia="es-ES"/>
     </w:rPr>
   </w:style>
-  <w:style w:type="character" w:customStyle="1" w:styleId="Sangra3detindependienteCar">
-    <w:name w:val="Sangría 3 de t. independiente Car"/>
-    <w:basedOn w:val="Fuentedeprrafopredeter"/>
-    <w:link w:val="Sangra3detindependiente"/>
+  <w:style w:type="character" w:customStyle="1" w:styleId="BodyTextIndent3Char">
+    <w:name w:val="Body Text Indent 3 Char"/>
+    <w:basedOn w:val="DefaultParagraphFont"/>
+    <w:link w:val="BodyTextIndent3"/>
     <w:uiPriority w:val="99"/>
     <w:rsid w:val="0014625E"/>
     <w:rPr>
@@ -22733,19 +22724,19 @@
       <w14:ligatures w14:val="none"/>
     </w:rPr>
   </w:style>
-  <w:style w:type="paragraph" w:styleId="Textoindependiente">
+  <w:style w:type="paragraph" w:styleId="BodyText">
     <w:name w:val="Body Text"/>
     <w:basedOn w:val="Normal"/>
-    <w:link w:val="TextoindependienteCar"/>
+    <w:link w:val="BodyTextChar"/>
     <w:rsid w:val="0014625E"/>
     <w:pPr>
       <w:spacing w:after="120"/>
     </w:pPr>
   </w:style>
-  <w:style w:type="character" w:customStyle="1" w:styleId="TextoindependienteCar">
-    <w:name w:val="Texto independiente Car"/>
-    <w:basedOn w:val="Fuentedeprrafopredeter"/>
-    <w:link w:val="Textoindependiente"/>
+  <w:style w:type="character" w:customStyle="1" w:styleId="BodyTextChar">
+    <w:name w:val="Body Text Char"/>
+    <w:basedOn w:val="DefaultParagraphFont"/>
+    <w:link w:val="BodyText"/>
     <w:rsid w:val="0014625E"/>
     <w:rPr>
       <w:rFonts w:ascii="Times New Roman" w:eastAsia="Times New Roman" w:hAnsi="Times New Roman" w:cs="Times New Roman"/>
@@ -22780,9 +22771,9 @@
       <w:spacing w:before="100" w:beforeAutospacing="1" w:after="100" w:afterAutospacing="1"/>
     </w:pPr>
   </w:style>
-  <w:style w:type="character" w:styleId="Textoennegrita">
+  <w:style w:type="character" w:styleId="Strong">
     <w:name w:val="Strong"/>
-    <w:basedOn w:val="Fuentedeprrafopredeter"/>
+    <w:basedOn w:val="DefaultParagraphFont"/>
     <w:uiPriority w:val="22"/>
     <w:qFormat/>
     <w:rsid w:val="0014625E"/>
@@ -22791,20 +22782,20 @@
       <w:bCs/>
     </w:rPr>
   </w:style>
-  <w:style w:type="paragraph" w:styleId="Textocomentario">
+  <w:style w:type="paragraph" w:styleId="CommentText">
     <w:name w:val="annotation text"/>
     <w:basedOn w:val="Normal"/>
-    <w:link w:val="TextocomentarioCar"/>
+    <w:link w:val="CommentTextChar"/>
     <w:rsid w:val="0014625E"/>
     <w:rPr>
       <w:sz w:val="20"/>
       <w:szCs w:val="20"/>
     </w:rPr>
   </w:style>
-  <w:style w:type="character" w:customStyle="1" w:styleId="TextocomentarioCar">
-    <w:name w:val="Texto comentario Car"/>
-    <w:basedOn w:val="Fuentedeprrafopredeter"/>
-    <w:link w:val="Textocomentario"/>
+  <w:style w:type="character" w:customStyle="1" w:styleId="CommentTextChar">
+    <w:name w:val="Comment Text Char"/>
+    <w:basedOn w:val="DefaultParagraphFont"/>
+    <w:link w:val="CommentText"/>
     <w:rsid w:val="0014625E"/>
     <w:rPr>
       <w:rFonts w:ascii="Times New Roman" w:eastAsia="Times New Roman" w:hAnsi="Times New Roman" w:cs="Times New Roman"/>
@@ -22815,20 +22806,20 @@
       <w14:ligatures w14:val="none"/>
     </w:rPr>
   </w:style>
-  <w:style w:type="character" w:styleId="Refdecomentario">
+  <w:style w:type="character" w:styleId="CommentReference">
     <w:name w:val="annotation reference"/>
-    <w:basedOn w:val="Fuentedeprrafopredeter"/>
+    <w:basedOn w:val="DefaultParagraphFont"/>
     <w:rsid w:val="0014625E"/>
     <w:rPr>
       <w:sz w:val="16"/>
       <w:szCs w:val="16"/>
     </w:rPr>
   </w:style>
-  <w:style w:type="paragraph" w:styleId="Asuntodelcomentario">
+  <w:style w:type="paragraph" w:styleId="CommentSubject">
     <w:name w:val="annotation subject"/>
-    <w:basedOn w:val="Textocomentario"/>
-    <w:next w:val="Textocomentario"/>
-    <w:link w:val="AsuntodelcomentarioCar"/>
+    <w:basedOn w:val="CommentText"/>
+    <w:next w:val="CommentText"/>
+    <w:link w:val="CommentSubjectChar"/>
     <w:semiHidden/>
     <w:unhideWhenUsed/>
     <w:rsid w:val="0014625E"/>
@@ -22837,10 +22828,10 @@
       <w:bCs/>
     </w:rPr>
   </w:style>
-  <w:style w:type="character" w:customStyle="1" w:styleId="AsuntodelcomentarioCar">
-    <w:name w:val="Asunto del comentario Car"/>
-    <w:basedOn w:val="TextocomentarioCar"/>
-    <w:link w:val="Asuntodelcomentario"/>
+  <w:style w:type="character" w:customStyle="1" w:styleId="CommentSubjectChar">
+    <w:name w:val="Comment Subject Char"/>
+    <w:basedOn w:val="CommentTextChar"/>
+    <w:link w:val="CommentSubject"/>
     <w:semiHidden/>
     <w:rsid w:val="0014625E"/>
     <w:rPr>

</xml_diff>